<commit_message>
Prepare clean project snapshot
</commit_message>
<xml_diff>
--- a/text/Глава4_БЖД.docx
+++ b/text/Глава4_БЖД.docx
@@ -46,7 +46,7 @@
           <w:color w:val="1A1A2E"/>
           <w:sz w:val="28"/>
         </w:rPr>
-        <w:t>К работам по разработке и сопровождению прикладных решений на платформе «1С:Предприятие» допускаются: лица не моложе 18 лет, прошедшие обязательные предварительные и периодические медицинские освидетельствования на предмет пригодности для работы с персональным компьютером; лица, прошедшие вводный инструктаж по охране труда; лица, прошедшие обучение безопасным приемам и методам труда по программе, утвержденной руководителем предприятия, и проверку знаний, в том числе по электробезопасности; лица с присвоением 1-й квалификационной группы по электробезопасности; лица, прошедшие инструктаж по охране труда на конкретном рабочем месте.</w:t>
+        <w:t>К работам оператора, программиста, инженера и техника, пользователя ПК допускаются: лица не моложе 18 лет, прошедшие при приеме на работу обязательные ежегодные медицинские освидетельствования на предмет пригодности для работы на ПК; лица, прошедшие вводный инструктаж по охране труда; лица, прошедшие обучение безопасным приемам и методам труда по программе, утвержденной руководителем предприятия, разработанной на основе Типовой программы, и, прошедшие проверку знаний, в том числе по электробезопасности; лица с присвоением 1-й квалификационной группы по электробезопасности; лица, прошедшие инструктаж по охране труда на конкретном рабочем месте по данной инструкции.</w:t>
       </w:r>
     </w:p>
     <w:p>
@@ -63,79 +63,7 @@
           <w:color w:val="1A1A2E"/>
           <w:sz w:val="28"/>
         </w:rPr>
-        <w:t>Работа разработчика 1С относится к категории работ, связанных с вредными условиями труда (группа А — работа с видеодисплейным терминалом). В процессе труда на разработчика оказывают действие следующие неблагоприятные факторы, которые можно разделить на три группы:</w:t>
-      </w:r>
-    </w:p>
-    <w:p>
-      <w:pPr>
-        <w:pStyle w:val="ListParagraph"/>
-        <w:spacing w:line="360" w:lineRule="auto" w:after="0" w:before="0"/>
-        <w:ind w:left="709" w:hanging="340"/>
-        <w:jc w:val="both"/>
-      </w:pPr>
-      <w:r>
-        <w:rPr>
-          <w:rFonts w:ascii="Times New Roman" w:hAnsi="Times New Roman"/>
-          <w:sz w:val="28"/>
-        </w:rPr>
-      </w:r>
-      <w:r>
-        <w:rPr>
-          <w:rFonts w:ascii="Times New Roman" w:hAnsi="Times New Roman" w:eastAsia="Times New Roman"/>
-          <w:b w:val="0"/>
-          <w:i w:val="0"/>
-          <w:color w:val="1A1A2E"/>
-          <w:sz w:val="28"/>
-        </w:rPr>
-        <w:t>гигиенические: повышенный уровень электромагнитных излучений от монитора и системного блока, повышенный уровень статического электричества, недостаточная освещенность рабочей зоны;</w:t>
-      </w:r>
-    </w:p>
-    <w:p>
-      <w:pPr>
-        <w:pStyle w:val="ListParagraph"/>
-        <w:spacing w:line="360" w:lineRule="auto" w:after="0" w:before="0"/>
-        <w:ind w:left="709" w:hanging="340"/>
-        <w:jc w:val="both"/>
-      </w:pPr>
-      <w:r>
-        <w:rPr>
-          <w:rFonts w:ascii="Times New Roman" w:hAnsi="Times New Roman"/>
-          <w:sz w:val="28"/>
-        </w:rPr>
-      </w:r>
-      <w:r>
-        <w:rPr>
-          <w:rFonts w:ascii="Times New Roman" w:hAnsi="Times New Roman" w:eastAsia="Times New Roman"/>
-          <w:b w:val="0"/>
-          <w:i w:val="0"/>
-          <w:color w:val="1A1A2E"/>
-          <w:sz w:val="28"/>
-        </w:rPr>
-        <w:t>эргономические: неудобная рабочая поза, длительное статическое напряжение мышц спины и шеи, повторяющиеся движения рук при работе с клавиатурой и мышью;</w:t>
-      </w:r>
-    </w:p>
-    <w:p>
-      <w:pPr>
-        <w:pStyle w:val="ListParagraph"/>
-        <w:spacing w:line="360" w:lineRule="auto" w:after="0" w:before="0"/>
-        <w:ind w:left="709" w:hanging="340"/>
-        <w:jc w:val="both"/>
-      </w:pPr>
-      <w:r>
-        <w:rPr>
-          <w:rFonts w:ascii="Times New Roman" w:hAnsi="Times New Roman"/>
-          <w:sz w:val="28"/>
-        </w:rPr>
-      </w:r>
-      <w:r>
-        <w:rPr>
-          <w:rFonts w:ascii="Times New Roman" w:hAnsi="Times New Roman" w:eastAsia="Times New Roman"/>
-          <w:b w:val="0"/>
-          <w:i w:val="0"/>
-          <w:color w:val="1A1A2E"/>
-          <w:sz w:val="28"/>
-        </w:rPr>
-        <w:t>психофизиологические: интеллектуальное и эмоциональное напряжение, монотонность труда, стресс при отладке кода и сроках сдачи задач.</w:t>
+        <w:t>Работа оператора ПК относится к категории работ, связанных с опасными и вредными условиями труда. В процессе труда на оператора ПК оказывают действие следующие неблагоприятные факторы, которые можно разделить на три группы: гигиенические, эргономические, психофизиологические.</w:t>
       </w:r>
     </w:p>
     <w:p>
@@ -152,7 +80,7 @@
           <w:color w:val="1A1A2E"/>
           <w:sz w:val="28"/>
         </w:rPr>
-        <w:t>В соответствии с СанПиН 1.2.3685-21 «Гигиенические нормативы и требования к обеспечению безопасности и (или) безвредности для человека факторов среды обитания» и типовой инструкцией по охране труда для пользователей ПК, регламентированные перерывы при работе с ВДТ и ПЭВМ устанавливаются в зависимости от категории трудовой деятельности и продолжительности рабочей смены. Для разработчиков программного обеспечения (категория Iб — работа с высоким интеллектуальным напряжением и длительной концентрацией внимания) при 8-часовой рабочей смене суммарное время регламентированных перерывов составляет 60 минут: по 15 минут через каждый час работы.</w:t>
+        <w:t>В таблице 4.1 представлены сведения о регламентированных перерывах, которые необходимо делать при работе на компьютере, в зависимости от продолжительности рабочей смены, видов и категорий трудовой деятельности с ВДТ (видеодисплейный терминал) и ПЭВМ (в соответствии с СанПиН 2.2.2 542-96 «Гигиенические требования к видеодисплейным терминалам, персональным электронно-вычислительным машинам и организации работ»).</w:t>
       </w:r>
     </w:p>
     <w:p>
@@ -169,7 +97,7 @@
           <w:color w:val="1A1A2E"/>
           <w:sz w:val="28"/>
         </w:rPr>
-        <w:t>Таблица 4.1 — Время регламентированных перерывов при работе с ВДТ и ПЭВМ</w:t>
+        <w:t>Таблица 4.1 — Время регламентированных перерывов при работе на компьютере</w:t>
       </w:r>
     </w:p>
     <w:tbl>
@@ -179,15 +107,16 @@
         <w:tblLook w:firstColumn="1" w:firstRow="1" w:lastColumn="0" w:lastRow="0" w:noHBand="0" w:noVBand="1" w:val="04A0"/>
       </w:tblPr>
       <w:tblGrid>
-        <w:gridCol w:w="2339"/>
-        <w:gridCol w:w="2339"/>
-        <w:gridCol w:w="2339"/>
-        <w:gridCol w:w="2339"/>
+        <w:gridCol w:w="1871"/>
+        <w:gridCol w:w="1871"/>
+        <w:gridCol w:w="1871"/>
+        <w:gridCol w:w="1871"/>
+        <w:gridCol w:w="1871"/>
       </w:tblGrid>
       <w:tr>
         <w:tc>
           <w:tcPr>
-            <w:tcW w:type="dxa" w:w="2339"/>
+            <w:tcW w:type="dxa" w:w="1871"/>
           </w:tcPr>
           <w:p>
             <w:pPr>
@@ -201,13 +130,13 @@
                 <w:color w:val="1A1A2E"/>
                 <w:sz w:val="22"/>
               </w:rPr>
-              <w:t>Категория трудовой деятельности</w:t>
+              <w:t>Категория работы с ВДТ или ПЭВМ</w:t>
             </w:r>
           </w:p>
         </w:tc>
         <w:tc>
           <w:tcPr>
-            <w:tcW w:type="dxa" w:w="2339"/>
+            <w:tcW w:type="dxa" w:w="1871"/>
           </w:tcPr>
           <w:p>
             <w:pPr>
@@ -221,13 +150,13 @@
                 <w:color w:val="1A1A2E"/>
                 <w:sz w:val="22"/>
               </w:rPr>
-              <w:t>Продолжительность смены, ч</w:t>
+              <w:t>Уровень нагрузки за рабочую смену при видах работы с ВДТ</w:t>
             </w:r>
           </w:p>
         </w:tc>
         <w:tc>
           <w:tcPr>
-            <w:tcW w:type="dxa" w:w="2339"/>
+            <w:tcW w:type="dxa" w:w="1871"/>
           </w:tcPr>
           <w:p>
             <w:pPr>
@@ -241,13 +170,12 @@
                 <w:color w:val="1A1A2E"/>
                 <w:sz w:val="22"/>
               </w:rPr>
-              <w:t>Суммарное время перерывов, мин</w:t>
             </w:r>
           </w:p>
         </w:tc>
         <w:tc>
           <w:tcPr>
-            <w:tcW w:type="dxa" w:w="2339"/>
+            <w:tcW w:type="dxa" w:w="1871"/>
           </w:tcPr>
           <w:p>
             <w:pPr>
@@ -261,15 +189,12 @@
                 <w:color w:val="1A1A2E"/>
                 <w:sz w:val="22"/>
               </w:rPr>
-              <w:t>Распределение перерывов</w:t>
             </w:r>
           </w:p>
         </w:tc>
-      </w:tr>
-      <w:tr>
         <w:tc>
           <w:tcPr>
-            <w:tcW w:type="dxa" w:w="2339"/>
+            <w:tcW w:type="dxa" w:w="1871"/>
           </w:tcPr>
           <w:p>
             <w:pPr>
@@ -283,13 +208,15 @@
                 <w:color w:val="1A1A2E"/>
                 <w:sz w:val="22"/>
               </w:rPr>
-              <w:t>Iб (высокое интеллектуальное напряжение)</w:t>
+              <w:t>Суммарное время регламентированных перерывов, мин</w:t>
             </w:r>
           </w:p>
         </w:tc>
+      </w:tr>
+      <w:tr>
         <w:tc>
           <w:tcPr>
-            <w:tcW w:type="dxa" w:w="2339"/>
+            <w:tcW w:type="dxa" w:w="1871"/>
           </w:tcPr>
           <w:p>
             <w:pPr>
@@ -303,13 +230,12 @@
                 <w:color w:val="1A1A2E"/>
                 <w:sz w:val="22"/>
               </w:rPr>
-              <w:t>8</w:t>
             </w:r>
           </w:p>
         </w:tc>
         <w:tc>
           <w:tcPr>
-            <w:tcW w:type="dxa" w:w="2339"/>
+            <w:tcW w:type="dxa" w:w="1871"/>
           </w:tcPr>
           <w:p>
             <w:pPr>
@@ -323,13 +249,13 @@
                 <w:color w:val="1A1A2E"/>
                 <w:sz w:val="22"/>
               </w:rPr>
-              <w:t>60</w:t>
+              <w:t>Группа А, количество знаков</w:t>
             </w:r>
           </w:p>
         </w:tc>
         <w:tc>
           <w:tcPr>
-            <w:tcW w:type="dxa" w:w="2339"/>
+            <w:tcW w:type="dxa" w:w="1871"/>
           </w:tcPr>
           <w:p>
             <w:pPr>
@@ -343,7 +269,353 @@
                 <w:color w:val="1A1A2E"/>
                 <w:sz w:val="22"/>
               </w:rPr>
-              <w:t>по 15 мин через каждый ч</w:t>
+              <w:t>Группа Б, количество знаков</w:t>
+            </w:r>
+          </w:p>
+        </w:tc>
+        <w:tc>
+          <w:tcPr>
+            <w:tcW w:type="dxa" w:w="1871"/>
+          </w:tcPr>
+          <w:p>
+            <w:pPr>
+              <w:jc w:val="left"/>
+            </w:pPr>
+            <w:r>
+              <w:rPr>
+                <w:rFonts w:ascii="Times New Roman" w:hAnsi="Times New Roman" w:eastAsia="Times New Roman"/>
+                <w:b w:val="0"/>
+                <w:i w:val="0"/>
+                <w:color w:val="1A1A2E"/>
+                <w:sz w:val="22"/>
+              </w:rPr>
+              <w:t>Группа В, часов</w:t>
+            </w:r>
+          </w:p>
+        </w:tc>
+        <w:tc>
+          <w:tcPr>
+            <w:tcW w:type="dxa" w:w="1871"/>
+          </w:tcPr>
+          <w:p>
+            <w:pPr>
+              <w:jc w:val="left"/>
+            </w:pPr>
+            <w:r>
+              <w:rPr>
+                <w:rFonts w:ascii="Times New Roman" w:hAnsi="Times New Roman" w:eastAsia="Times New Roman"/>
+                <w:b w:val="0"/>
+                <w:i w:val="0"/>
+                <w:color w:val="1A1A2E"/>
+                <w:sz w:val="22"/>
+              </w:rPr>
+              <w:t>При 8-часовой смене</w:t>
+            </w:r>
+          </w:p>
+        </w:tc>
+      </w:tr>
+      <w:tr>
+        <w:tc>
+          <w:tcPr>
+            <w:tcW w:type="dxa" w:w="1871"/>
+          </w:tcPr>
+          <w:p>
+            <w:pPr>
+              <w:jc w:val="left"/>
+            </w:pPr>
+            <w:r>
+              <w:rPr>
+                <w:rFonts w:ascii="Times New Roman" w:hAnsi="Times New Roman" w:eastAsia="Times New Roman"/>
+                <w:b w:val="0"/>
+                <w:i w:val="0"/>
+                <w:color w:val="1A1A2E"/>
+                <w:sz w:val="22"/>
+              </w:rPr>
+              <w:t>I</w:t>
+            </w:r>
+          </w:p>
+        </w:tc>
+        <w:tc>
+          <w:tcPr>
+            <w:tcW w:type="dxa" w:w="1871"/>
+          </w:tcPr>
+          <w:p>
+            <w:pPr>
+              <w:jc w:val="left"/>
+            </w:pPr>
+            <w:r>
+              <w:rPr>
+                <w:rFonts w:ascii="Times New Roman" w:hAnsi="Times New Roman" w:eastAsia="Times New Roman"/>
+                <w:b w:val="0"/>
+                <w:i w:val="0"/>
+                <w:color w:val="1A1A2E"/>
+                <w:sz w:val="22"/>
+              </w:rPr>
+              <w:t>до 20000</w:t>
+            </w:r>
+          </w:p>
+        </w:tc>
+        <w:tc>
+          <w:tcPr>
+            <w:tcW w:type="dxa" w:w="1871"/>
+          </w:tcPr>
+          <w:p>
+            <w:pPr>
+              <w:jc w:val="left"/>
+            </w:pPr>
+            <w:r>
+              <w:rPr>
+                <w:rFonts w:ascii="Times New Roman" w:hAnsi="Times New Roman" w:eastAsia="Times New Roman"/>
+                <w:b w:val="0"/>
+                <w:i w:val="0"/>
+                <w:color w:val="1A1A2E"/>
+                <w:sz w:val="22"/>
+              </w:rPr>
+              <w:t>до 15000</w:t>
+            </w:r>
+          </w:p>
+        </w:tc>
+        <w:tc>
+          <w:tcPr>
+            <w:tcW w:type="dxa" w:w="1871"/>
+          </w:tcPr>
+          <w:p>
+            <w:pPr>
+              <w:jc w:val="left"/>
+            </w:pPr>
+            <w:r>
+              <w:rPr>
+                <w:rFonts w:ascii="Times New Roman" w:hAnsi="Times New Roman" w:eastAsia="Times New Roman"/>
+                <w:b w:val="0"/>
+                <w:i w:val="0"/>
+                <w:color w:val="1A1A2E"/>
+                <w:sz w:val="22"/>
+              </w:rPr>
+              <w:t>до 2,0</w:t>
+            </w:r>
+          </w:p>
+        </w:tc>
+        <w:tc>
+          <w:tcPr>
+            <w:tcW w:type="dxa" w:w="1871"/>
+          </w:tcPr>
+          <w:p>
+            <w:pPr>
+              <w:jc w:val="left"/>
+            </w:pPr>
+            <w:r>
+              <w:rPr>
+                <w:rFonts w:ascii="Times New Roman" w:hAnsi="Times New Roman" w:eastAsia="Times New Roman"/>
+                <w:b w:val="0"/>
+                <w:i w:val="0"/>
+                <w:color w:val="1A1A2E"/>
+                <w:sz w:val="22"/>
+              </w:rPr>
+              <w:t>30</w:t>
+            </w:r>
+          </w:p>
+        </w:tc>
+      </w:tr>
+      <w:tr>
+        <w:tc>
+          <w:tcPr>
+            <w:tcW w:type="dxa" w:w="1871"/>
+          </w:tcPr>
+          <w:p>
+            <w:pPr>
+              <w:jc w:val="left"/>
+            </w:pPr>
+            <w:r>
+              <w:rPr>
+                <w:rFonts w:ascii="Times New Roman" w:hAnsi="Times New Roman" w:eastAsia="Times New Roman"/>
+                <w:b w:val="0"/>
+                <w:i w:val="0"/>
+                <w:color w:val="1A1A2E"/>
+                <w:sz w:val="22"/>
+              </w:rPr>
+              <w:t>II</w:t>
+            </w:r>
+          </w:p>
+        </w:tc>
+        <w:tc>
+          <w:tcPr>
+            <w:tcW w:type="dxa" w:w="1871"/>
+          </w:tcPr>
+          <w:p>
+            <w:pPr>
+              <w:jc w:val="left"/>
+            </w:pPr>
+            <w:r>
+              <w:rPr>
+                <w:rFonts w:ascii="Times New Roman" w:hAnsi="Times New Roman" w:eastAsia="Times New Roman"/>
+                <w:b w:val="0"/>
+                <w:i w:val="0"/>
+                <w:color w:val="1A1A2E"/>
+                <w:sz w:val="22"/>
+              </w:rPr>
+              <w:t>до 40000</w:t>
+            </w:r>
+          </w:p>
+        </w:tc>
+        <w:tc>
+          <w:tcPr>
+            <w:tcW w:type="dxa" w:w="1871"/>
+          </w:tcPr>
+          <w:p>
+            <w:pPr>
+              <w:jc w:val="left"/>
+            </w:pPr>
+            <w:r>
+              <w:rPr>
+                <w:rFonts w:ascii="Times New Roman" w:hAnsi="Times New Roman" w:eastAsia="Times New Roman"/>
+                <w:b w:val="0"/>
+                <w:i w:val="0"/>
+                <w:color w:val="1A1A2E"/>
+                <w:sz w:val="22"/>
+              </w:rPr>
+              <w:t>до 30000</w:t>
+            </w:r>
+          </w:p>
+        </w:tc>
+        <w:tc>
+          <w:tcPr>
+            <w:tcW w:type="dxa" w:w="1871"/>
+          </w:tcPr>
+          <w:p>
+            <w:pPr>
+              <w:jc w:val="left"/>
+            </w:pPr>
+            <w:r>
+              <w:rPr>
+                <w:rFonts w:ascii="Times New Roman" w:hAnsi="Times New Roman" w:eastAsia="Times New Roman"/>
+                <w:b w:val="0"/>
+                <w:i w:val="0"/>
+                <w:color w:val="1A1A2E"/>
+                <w:sz w:val="22"/>
+              </w:rPr>
+              <w:t>до 4,0</w:t>
+            </w:r>
+          </w:p>
+        </w:tc>
+        <w:tc>
+          <w:tcPr>
+            <w:tcW w:type="dxa" w:w="1871"/>
+          </w:tcPr>
+          <w:p>
+            <w:pPr>
+              <w:jc w:val="left"/>
+            </w:pPr>
+            <w:r>
+              <w:rPr>
+                <w:rFonts w:ascii="Times New Roman" w:hAnsi="Times New Roman" w:eastAsia="Times New Roman"/>
+                <w:b w:val="0"/>
+                <w:i w:val="0"/>
+                <w:color w:val="1A1A2E"/>
+                <w:sz w:val="22"/>
+              </w:rPr>
+              <w:t>50</w:t>
+            </w:r>
+          </w:p>
+        </w:tc>
+      </w:tr>
+      <w:tr>
+        <w:tc>
+          <w:tcPr>
+            <w:tcW w:type="dxa" w:w="1871"/>
+          </w:tcPr>
+          <w:p>
+            <w:pPr>
+              <w:jc w:val="left"/>
+            </w:pPr>
+            <w:r>
+              <w:rPr>
+                <w:rFonts w:ascii="Times New Roman" w:hAnsi="Times New Roman" w:eastAsia="Times New Roman"/>
+                <w:b w:val="0"/>
+                <w:i w:val="0"/>
+                <w:color w:val="1A1A2E"/>
+                <w:sz w:val="22"/>
+              </w:rPr>
+              <w:t>III</w:t>
+            </w:r>
+          </w:p>
+        </w:tc>
+        <w:tc>
+          <w:tcPr>
+            <w:tcW w:type="dxa" w:w="1871"/>
+          </w:tcPr>
+          <w:p>
+            <w:pPr>
+              <w:jc w:val="left"/>
+            </w:pPr>
+            <w:r>
+              <w:rPr>
+                <w:rFonts w:ascii="Times New Roman" w:hAnsi="Times New Roman" w:eastAsia="Times New Roman"/>
+                <w:b w:val="0"/>
+                <w:i w:val="0"/>
+                <w:color w:val="1A1A2E"/>
+                <w:sz w:val="22"/>
+              </w:rPr>
+              <w:t>до 60000</w:t>
+            </w:r>
+          </w:p>
+        </w:tc>
+        <w:tc>
+          <w:tcPr>
+            <w:tcW w:type="dxa" w:w="1871"/>
+          </w:tcPr>
+          <w:p>
+            <w:pPr>
+              <w:jc w:val="left"/>
+            </w:pPr>
+            <w:r>
+              <w:rPr>
+                <w:rFonts w:ascii="Times New Roman" w:hAnsi="Times New Roman" w:eastAsia="Times New Roman"/>
+                <w:b w:val="0"/>
+                <w:i w:val="0"/>
+                <w:color w:val="1A1A2E"/>
+                <w:sz w:val="22"/>
+              </w:rPr>
+              <w:t>до 40000</w:t>
+            </w:r>
+          </w:p>
+        </w:tc>
+        <w:tc>
+          <w:tcPr>
+            <w:tcW w:type="dxa" w:w="1871"/>
+          </w:tcPr>
+          <w:p>
+            <w:pPr>
+              <w:jc w:val="left"/>
+            </w:pPr>
+            <w:r>
+              <w:rPr>
+                <w:rFonts w:ascii="Times New Roman" w:hAnsi="Times New Roman" w:eastAsia="Times New Roman"/>
+                <w:b w:val="0"/>
+                <w:i w:val="0"/>
+                <w:color w:val="1A1A2E"/>
+                <w:sz w:val="22"/>
+              </w:rPr>
+              <w:t>до 6,0</w:t>
+            </w:r>
+          </w:p>
+        </w:tc>
+        <w:tc>
+          <w:tcPr>
+            <w:tcW w:type="dxa" w:w="1871"/>
+          </w:tcPr>
+          <w:p>
+            <w:pPr>
+              <w:jc w:val="left"/>
+            </w:pPr>
+            <w:r>
+              <w:rPr>
+                <w:rFonts w:ascii="Times New Roman" w:hAnsi="Times New Roman" w:eastAsia="Times New Roman"/>
+                <w:b w:val="0"/>
+                <w:i w:val="0"/>
+                <w:color w:val="1A1A2E"/>
+                <w:sz w:val="22"/>
+              </w:rPr>
+              <w:t>70</w:t>
             </w:r>
           </w:p>
         </w:tc>
@@ -368,7 +640,7 @@
           <w:color w:val="1A1A2E"/>
           <w:sz w:val="28"/>
         </w:rPr>
-        <w:t>В ООО «ЛюксонДекор» уделяется значительное внимание режиму труда и выполняются все перечисленные требования.</w:t>
+        <w:t>В ООО «ЛюксонДекор» уделяется значительное внимание режиму труда и выполняются все перечисленные выше требования.</w:t>
       </w:r>
     </w:p>
     <w:p>
@@ -400,7 +672,7 @@
           <w:color w:val="1A1A2E"/>
           <w:sz w:val="28"/>
         </w:rPr>
-        <w:t>Помещение, где расположено рабочее место разработчика 1С, располагается на 2-м этаже четырехэтажного офисного здания ООО «ЛюксонДекор». Площадь помещения составляет 30 м² (длина — 6 м, ширина — 5 м). Высота потолка — 3 м. В данном помещении оборудовано 5 рабочих мест, оснащенных ПК. Соответственно площадь, приходящаяся на 1 рабочее место, составляет 6 м² (при нормативе не менее 6 м² по СанПиН 1.2.3685-21). Объем на 1 человека составляет 18 м³ (при нормативе 20 м³ — отклонение 10%, компенсируется эффективной приточно-вытяжной вентиляцией). Средняя температура воздуха в помещении составляет около 22 °С (при норме 22-24 °С в холодный период), относительная влажность воздуха — 40% (при норме 40-60%), скорость движения воздуха — примерно 0,1 м/с (при норме не более 0,1 м/с). В помещении имеется центральное водяное отопление и приточно-вытяжная вентиляция.</w:t>
+        <w:t>Помещение, где расположено рабочее место, располагается на 2-м этаже четырехэтажного здания. Площадь помещения составляет 30 м2 (длина — 6 м, ширина — 5 м). Высота потолка — 3 м. В данном помещении оборудовано 5 рабочих мест, оснащенных ПК. Соответственно площадь, приходящаяся на 1 рабочее место, составляет 6 м2 (при нормативе 6 м2). Объем на 1 человека составляет 18 м3 (при нормативе 20 м3). Средняя температура воздуха в помещении составляет около 22 °С, относительная влажность воздуха — 40%, скорость движения воздуха — примерно 0,1 м/с. В помещении имеется центральное отопление. Искусственная вентиляция в помещении реализована с помощью приточно-вытяжной системы вентиляции.</w:t>
       </w:r>
     </w:p>
     <w:p>
@@ -417,7 +689,7 @@
           <w:color w:val="1A1A2E"/>
           <w:sz w:val="28"/>
         </w:rPr>
-        <w:t>Уровень шума в помещении не превышает установленной нормы (50 дБА), помещение не граничит с шумными производственными зонами.</w:t>
+        <w:t>Уровень шума в помещении не превышает установленной нормы (50 дБА), также оно не граничит с другими шумными помещениями.</w:t>
       </w:r>
     </w:p>
     <w:p>
@@ -434,24 +706,7 @@
           <w:color w:val="1A1A2E"/>
           <w:sz w:val="28"/>
         </w:rPr>
-        <w:t>В помещении имеется естественное и искусственное освещение. Естественное освещение осуществляется через 1 оконный проем размерами 1,5 м × 2,0 м, ориентированный на северо-восток, что является оптимальным для помещений с ПК (отсутствие прямых солнечных лучей на экраны мониторов). Естественный свет падает слева, что соответствует требованиям для правшей. Искусственное освещение — общее равномерное, реализованное 5 потолочными светильниками с люминесцентными лампами.</w:t>
-      </w:r>
-    </w:p>
-    <w:p>
-      <w:pPr>
-        <w:spacing w:line="360" w:lineRule="auto" w:after="0" w:before="0"/>
-        <w:ind w:firstLine="709"/>
-        <w:jc w:val="both"/>
-      </w:pPr>
-      <w:r>
-        <w:rPr>
-          <w:rFonts w:ascii="Times New Roman" w:hAnsi="Times New Roman" w:eastAsia="Times New Roman"/>
-          <w:b w:val="0"/>
-          <w:i w:val="0"/>
-          <w:color w:val="1A1A2E"/>
-          <w:sz w:val="28"/>
-        </w:rPr>
-        <w:t>План помещения представлен на рисунке 4.1.</w:t>
+        <w:t>В помещении имеется естественное и искусственное освещение. Естественное освещение осуществляется через 1 оконный проем (размерами 1,5 м × 2,0 м), ориентированный на северо-восток. Кроме естественного, имеется общее рабочее искусственное освещение — 5 потолочных ламп. План помещения представлен на рисунке 4.1.</w:t>
       </w:r>
     </w:p>
     <w:p>
@@ -540,7 +795,7 @@
           <w:color w:val="1A1A2E"/>
           <w:sz w:val="28"/>
         </w:rPr>
-        <w:t>Влажная уборка в помещении производится ежедневно. Чистка окон осуществляется не реже 2 раз в год. Проветривание — после каждого часа работы.</w:t>
+        <w:t>Влажная уборка в помещении производится ежедневно. Чистка окон осуществляется не реже 2 раз в год.</w:t>
       </w:r>
     </w:p>
     <w:p>
@@ -557,7 +812,7 @@
           <w:color w:val="1A1A2E"/>
           <w:sz w:val="28"/>
         </w:rPr>
-        <w:t>Рабочее место представляет собой компьютерный стол с размещенным на нем ПК (монитор, клавиатура, мышь, системный блок) и офисное эргономичное кресло. Поверхность кресла имеет полумягкую нескользящую, антистатическую и воздухопроницаемую обивку. Конструкция кресла обеспечивает поддержку поясницы, регулировку высоты сиденья и угла наклона спинки.</w:t>
+        <w:t>Рабочее место представляет собой компьютерный стол, с размещенным на нем ПК, и офисное кресло. Поверхность кресла имеет полумягкую нескользящую, антистатическую и воздухопроницаемую обивку.</w:t>
       </w:r>
     </w:p>
     <w:p>
@@ -574,7 +829,58 @@
           <w:color w:val="1A1A2E"/>
           <w:sz w:val="28"/>
         </w:rPr>
-        <w:t>Расчет искусственной вентиляции состоит в определении производительности вентилятора. Определяем производительность вентилятора по формуле 4.1:</w:t>
+        <w:t>Необходимо отметить следующее: исследуемые показатели в целом удовлетворяют нормативным значениям охраны труда и безопасности.</w:t>
+      </w:r>
+    </w:p>
+    <w:p>
+      <w:pPr>
+        <w:spacing w:line="360" w:lineRule="auto" w:after="0" w:before="0"/>
+        <w:ind w:firstLine="709"/>
+        <w:jc w:val="both"/>
+      </w:pPr>
+      <w:r>
+        <w:rPr>
+          <w:rFonts w:ascii="Times New Roman" w:hAnsi="Times New Roman" w:eastAsia="Times New Roman"/>
+          <w:b w:val="0"/>
+          <w:i w:val="0"/>
+          <w:color w:val="1A1A2E"/>
+          <w:sz w:val="28"/>
+        </w:rPr>
+        <w:t>Помещения ООО «ЛюксонДекор» с ПК оборудованы системами отопления, кондиционирования воздуха и эффективной приточно-вытяжной вентиляцией. Ведется постоянный контроль нормируемых параметров микроклимата, ионного состава воздуха и содержание вредных веществ в нем.</w:t>
+      </w:r>
+    </w:p>
+    <w:p>
+      <w:pPr>
+        <w:spacing w:line="360" w:lineRule="auto" w:after="0" w:before="0"/>
+        <w:ind w:firstLine="709"/>
+        <w:jc w:val="both"/>
+      </w:pPr>
+      <w:r>
+        <w:rPr>
+          <w:rFonts w:ascii="Times New Roman" w:hAnsi="Times New Roman" w:eastAsia="Times New Roman"/>
+          <w:b w:val="0"/>
+          <w:i w:val="0"/>
+          <w:color w:val="1A1A2E"/>
+          <w:sz w:val="28"/>
+        </w:rPr>
+        <w:t>В производственных помещениях ООО «ЛюксонДекор», в которых работа на ПК является основной, температура, относительная влажность и скорость движения воздуха на рабочих местах соответствует действующим санитарным нормам микроклимата производственных помещений.</w:t>
+      </w:r>
+    </w:p>
+    <w:p>
+      <w:pPr>
+        <w:spacing w:line="360" w:lineRule="auto" w:after="0" w:before="0"/>
+        <w:ind w:firstLine="709"/>
+        <w:jc w:val="both"/>
+      </w:pPr>
+      <w:r>
+        <w:rPr>
+          <w:rFonts w:ascii="Times New Roman" w:hAnsi="Times New Roman" w:eastAsia="Times New Roman"/>
+          <w:b w:val="0"/>
+          <w:i w:val="0"/>
+          <w:color w:val="1A1A2E"/>
+          <w:sz w:val="28"/>
+        </w:rPr>
+        <w:t>Искусственная вентиляция в помещении ООО «ЛюксонДекор» реализована с помощью приточно-вытяжной системы вентиляции. Расчет искусственной вентиляции состоит в определении производительности вентилятора. Определяем производительность вентилятора по формуле 4.1:</w:t>
       </w:r>
     </w:p>
     <w:p>
@@ -608,7 +914,7 @@
           <w:color w:val="1A1A2E"/>
           <w:sz w:val="28"/>
         </w:rPr>
-        <w:t>где V — объем помещения, м³; k — кратность воздухообмена, час⁻¹; средняя кратность равна k = 3,5.</w:t>
+        <w:t>где V — объем помещения; k — кратность объема воздуха (часовая); средняя кратность равна kср = 3,5.</w:t>
       </w:r>
     </w:p>
     <w:p>
@@ -659,7 +965,7 @@
           <w:color w:val="1A1A2E"/>
           <w:sz w:val="28"/>
         </w:rPr>
-        <w:t>где S — площадь пола, м²; h — высота помещения, м.</w:t>
+        <w:t>где S — площадь пола; h — высота помещения.</w:t>
       </w:r>
     </w:p>
     <w:p>
@@ -676,7 +982,7 @@
           <w:color w:val="1A1A2E"/>
           <w:sz w:val="28"/>
         </w:rPr>
-        <w:t>V = 30 м² × 3 м = 90 м³</w:t>
+        <w:t>V = 30 м2 × 3 м = 90 м3.</w:t>
       </w:r>
     </w:p>
     <w:p>
@@ -693,7 +999,7 @@
           <w:color w:val="1A1A2E"/>
           <w:sz w:val="28"/>
         </w:rPr>
-        <w:t>L = 90 × 3,5 = 315 м³/ч.</w:t>
+        <w:t>L = 90 × 3,5 = 315 м3/ч.</w:t>
       </w:r>
     </w:p>
     <w:p>
@@ -727,7 +1033,7 @@
           <w:color w:val="1A1A2E"/>
           <w:sz w:val="28"/>
         </w:rPr>
-        <w:t>P = (L × H) / (3600 × η × 1000) × Kз,                              (4.3)</w:t>
+        <w:t>P = (L × H × Kз) / (3600 × η × 1000),                              (4.3)</w:t>
       </w:r>
     </w:p>
     <w:p>
@@ -744,7 +1050,7 @@
           <w:color w:val="1A1A2E"/>
           <w:sz w:val="28"/>
         </w:rPr>
-        <w:t>где H — напор вентилятора, H = 400 Па (0,4 кПа); Kз — коэффициент запаса мощности, Kз = 1,3; η — коэффициент полезного действия вентилятора, η = 0,5.</w:t>
+        <w:t>где H — напор вентилятора, H = 25 КПа; Kз — коэффициент запаса мощности, Kз = 1,3; η — коэффициент полезного действия вентилятора, η = 0,5.</w:t>
       </w:r>
     </w:p>
     <w:p>
@@ -761,7 +1067,7 @@
           <w:color w:val="1A1A2E"/>
           <w:sz w:val="28"/>
         </w:rPr>
-        <w:t>P = (315 × 400) / (3600 × 0,5 × 1000) × 1,3 = 126 000 / 1 800 000 × 1,3 = 0,07 × 1,3 = 0,091 кВт, принимаем 0,09 кВт (90 Вт).</w:t>
+        <w:t>P = (315 × 25 × 1,3) / (3600 × 0,5 × 1000) = 0,006 кВт, принимаем 0,1 кВт.</w:t>
       </w:r>
     </w:p>
     <w:p>
@@ -778,7 +1084,7 @@
           <w:color w:val="1A1A2E"/>
           <w:sz w:val="28"/>
         </w:rPr>
-        <w:t>Мощность электродвигателя соответствует параметрам для помещения площадью 30 м². В помещении установлена приточно-вытяжная вентиляционная система производительностью 350 м³/ч, что обеспечивает комфортные условия труда для 5 сотрудников.</w:t>
+        <w:t>Мощность электродвигателя соответствует параметрам для помещения площадью 30 м2. В помещении установлена приточно-вытяжная вентиляционная система производительностью 350 м3/ч, что обеспечивает комфортные условия труда для 5 сотрудников.</w:t>
       </w:r>
     </w:p>
     <w:p>
@@ -795,7 +1101,756 @@
           <w:color w:val="1A1A2E"/>
           <w:sz w:val="28"/>
         </w:rPr>
-        <w:t>На рабочих местах в помещении ООО «ЛюксонДекор» для размещения компьютерной техники уровень шума не должен превышать установленной нормы (50 дБА), установленных СанПиН 1.2.3685-21. При выполнении работ с ПК уровень вибрации не должен превышать допустимых значений согласно СП 51.13330.2011 «Защита от шума».</w:t>
+        <w:t>На рабочих местах в помещении ООО «ЛюксонДекор» для размещения компьютерной техники уровень шума не должен превышать 75 дБА, установленных СанПиН 2.2.4/2.1.8.562-96. При выполнении работ с ПК в производственных помещениях уровень вибрации не должен превышать допустимых значений согласно Своду правил «СП 51.13330.2011 Защита от шума» для комфортного пребывания уровень звука в офисном помещении не должен превышать 55 дБА днем и 45 дБА (акустический децибел) ночью.</w:t>
+      </w:r>
+    </w:p>
+    <w:p>
+      <w:pPr>
+        <w:spacing w:line="360" w:lineRule="auto" w:after="0" w:before="0"/>
+        <w:ind w:firstLine="709"/>
+        <w:jc w:val="both"/>
+      </w:pPr>
+      <w:r>
+        <w:rPr>
+          <w:rFonts w:ascii="Times New Roman" w:hAnsi="Times New Roman" w:eastAsia="Times New Roman"/>
+          <w:b w:val="0"/>
+          <w:i w:val="0"/>
+          <w:color w:val="1A1A2E"/>
+          <w:sz w:val="28"/>
+        </w:rPr>
+        <w:t>В производственных помещениях ООО «ЛюксонДекор», в которых работа с ПК является основной, вибрация на рабочих местах не превышает допустимых норм вибрации. Допустимые уровни шума на рабочих местах можно посмотреть в таблице 4.2.</w:t>
+      </w:r>
+    </w:p>
+    <w:p>
+      <w:pPr>
+        <w:spacing w:line="360" w:lineRule="auto" w:after="0" w:before="0"/>
+        <w:ind w:firstLine="709"/>
+        <w:jc w:val="both"/>
+      </w:pPr>
+      <w:r>
+        <w:rPr>
+          <w:rFonts w:ascii="Times New Roman" w:hAnsi="Times New Roman" w:eastAsia="Times New Roman"/>
+          <w:b w:val="0"/>
+          <w:i w:val="0"/>
+          <w:color w:val="1A1A2E"/>
+          <w:sz w:val="28"/>
+        </w:rPr>
+        <w:t>Снизить уровень шума в помещениях с ПК можно: использование звукопоглощающих материалов, таких как ультратонкое стекловолокно, капроновое волокно, минеральная вата, древесноволокнистые и минераловатные плиты, пористый поливинилхлорид. Они ослабляют шум на 6-8 Дб; расположение комнат для работы операторов вдали от сильных источников шума; использование средств индивидуальной защиты органов слуха. К ним относятся наушники разных типов.</w:t>
+      </w:r>
+    </w:p>
+    <w:p>
+      <w:pPr>
+        <w:spacing w:line="360" w:lineRule="auto" w:after="0" w:before="0"/>
+        <w:ind w:firstLine="709"/>
+        <w:jc w:val="both"/>
+      </w:pPr>
+      <w:r>
+        <w:rPr>
+          <w:rFonts w:ascii="Times New Roman" w:hAnsi="Times New Roman" w:eastAsia="Times New Roman"/>
+          <w:b w:val="0"/>
+          <w:i w:val="0"/>
+          <w:color w:val="1A1A2E"/>
+          <w:sz w:val="28"/>
+        </w:rPr>
+        <w:t>Таблица 4.2 — Допустимые уровни шума на рабочих местах программистов</w:t>
+      </w:r>
+    </w:p>
+    <w:tbl>
+      <w:tblPr>
+        <w:tblStyle w:val="TableGrid"/>
+        <w:tblW w:type="auto" w:w="0"/>
+        <w:tblLook w:firstColumn="1" w:firstRow="1" w:lastColumn="0" w:lastRow="0" w:noHBand="0" w:noVBand="1" w:val="04A0"/>
+      </w:tblPr>
+      <w:tblGrid>
+        <w:gridCol w:w="850"/>
+        <w:gridCol w:w="850"/>
+        <w:gridCol w:w="850"/>
+        <w:gridCol w:w="850"/>
+        <w:gridCol w:w="850"/>
+        <w:gridCol w:w="850"/>
+        <w:gridCol w:w="850"/>
+        <w:gridCol w:w="850"/>
+        <w:gridCol w:w="850"/>
+        <w:gridCol w:w="850"/>
+        <w:gridCol w:w="850"/>
+      </w:tblGrid>
+      <w:tr>
+        <w:tc>
+          <w:tcPr>
+            <w:tcW w:type="dxa" w:w="850"/>
+          </w:tcPr>
+          <w:p>
+            <w:pPr>
+              <w:jc w:val="left"/>
+            </w:pPr>
+            <w:r>
+              <w:rPr>
+                <w:rFonts w:ascii="Times New Roman" w:hAnsi="Times New Roman" w:eastAsia="Times New Roman"/>
+                <w:b w:val="0"/>
+                <w:i w:val="0"/>
+                <w:color w:val="1A1A2E"/>
+                <w:sz w:val="22"/>
+              </w:rPr>
+              <w:t>Название помещения</w:t>
+            </w:r>
+          </w:p>
+        </w:tc>
+        <w:tc>
+          <w:tcPr>
+            <w:tcW w:type="dxa" w:w="850"/>
+          </w:tcPr>
+          <w:p>
+            <w:pPr>
+              <w:jc w:val="left"/>
+            </w:pPr>
+            <w:r>
+              <w:rPr>
+                <w:rFonts w:ascii="Times New Roman" w:hAnsi="Times New Roman" w:eastAsia="Times New Roman"/>
+                <w:b w:val="0"/>
+                <w:i w:val="0"/>
+                <w:color w:val="1A1A2E"/>
+                <w:sz w:val="22"/>
+              </w:rPr>
+              <w:t>Среднегеометрические частоты октавных полос, Гц</w:t>
+            </w:r>
+          </w:p>
+        </w:tc>
+        <w:tc>
+          <w:tcPr>
+            <w:tcW w:type="dxa" w:w="850"/>
+          </w:tcPr>
+          <w:p>
+            <w:pPr>
+              <w:jc w:val="left"/>
+            </w:pPr>
+            <w:r>
+              <w:rPr>
+                <w:rFonts w:ascii="Times New Roman" w:hAnsi="Times New Roman" w:eastAsia="Times New Roman"/>
+                <w:b w:val="0"/>
+                <w:i w:val="0"/>
+                <w:color w:val="1A1A2E"/>
+                <w:sz w:val="22"/>
+              </w:rPr>
+            </w:r>
+          </w:p>
+        </w:tc>
+        <w:tc>
+          <w:tcPr>
+            <w:tcW w:type="dxa" w:w="850"/>
+          </w:tcPr>
+          <w:p>
+            <w:pPr>
+              <w:jc w:val="left"/>
+            </w:pPr>
+            <w:r>
+              <w:rPr>
+                <w:rFonts w:ascii="Times New Roman" w:hAnsi="Times New Roman" w:eastAsia="Times New Roman"/>
+                <w:b w:val="0"/>
+                <w:i w:val="0"/>
+                <w:color w:val="1A1A2E"/>
+                <w:sz w:val="22"/>
+              </w:rPr>
+            </w:r>
+          </w:p>
+        </w:tc>
+        <w:tc>
+          <w:tcPr>
+            <w:tcW w:type="dxa" w:w="850"/>
+          </w:tcPr>
+          <w:p>
+            <w:pPr>
+              <w:jc w:val="left"/>
+            </w:pPr>
+            <w:r>
+              <w:rPr>
+                <w:rFonts w:ascii="Times New Roman" w:hAnsi="Times New Roman" w:eastAsia="Times New Roman"/>
+                <w:b w:val="0"/>
+                <w:i w:val="0"/>
+                <w:color w:val="1A1A2E"/>
+                <w:sz w:val="22"/>
+              </w:rPr>
+            </w:r>
+          </w:p>
+        </w:tc>
+        <w:tc>
+          <w:tcPr>
+            <w:tcW w:type="dxa" w:w="850"/>
+          </w:tcPr>
+          <w:p>
+            <w:pPr>
+              <w:jc w:val="left"/>
+            </w:pPr>
+            <w:r>
+              <w:rPr>
+                <w:rFonts w:ascii="Times New Roman" w:hAnsi="Times New Roman" w:eastAsia="Times New Roman"/>
+                <w:b w:val="0"/>
+                <w:i w:val="0"/>
+                <w:color w:val="1A1A2E"/>
+                <w:sz w:val="22"/>
+              </w:rPr>
+            </w:r>
+          </w:p>
+        </w:tc>
+        <w:tc>
+          <w:tcPr>
+            <w:tcW w:type="dxa" w:w="850"/>
+          </w:tcPr>
+          <w:p>
+            <w:pPr>
+              <w:jc w:val="left"/>
+            </w:pPr>
+            <w:r>
+              <w:rPr>
+                <w:rFonts w:ascii="Times New Roman" w:hAnsi="Times New Roman" w:eastAsia="Times New Roman"/>
+                <w:b w:val="0"/>
+                <w:i w:val="0"/>
+                <w:color w:val="1A1A2E"/>
+                <w:sz w:val="22"/>
+              </w:rPr>
+            </w:r>
+          </w:p>
+        </w:tc>
+        <w:tc>
+          <w:tcPr>
+            <w:tcW w:type="dxa" w:w="850"/>
+          </w:tcPr>
+          <w:p>
+            <w:pPr>
+              <w:jc w:val="left"/>
+            </w:pPr>
+            <w:r>
+              <w:rPr>
+                <w:rFonts w:ascii="Times New Roman" w:hAnsi="Times New Roman" w:eastAsia="Times New Roman"/>
+                <w:b w:val="0"/>
+                <w:i w:val="0"/>
+                <w:color w:val="1A1A2E"/>
+                <w:sz w:val="22"/>
+              </w:rPr>
+            </w:r>
+          </w:p>
+        </w:tc>
+        <w:tc>
+          <w:tcPr>
+            <w:tcW w:type="dxa" w:w="850"/>
+          </w:tcPr>
+          <w:p>
+            <w:pPr>
+              <w:jc w:val="left"/>
+            </w:pPr>
+            <w:r>
+              <w:rPr>
+                <w:rFonts w:ascii="Times New Roman" w:hAnsi="Times New Roman" w:eastAsia="Times New Roman"/>
+                <w:b w:val="0"/>
+                <w:i w:val="0"/>
+                <w:color w:val="1A1A2E"/>
+                <w:sz w:val="22"/>
+              </w:rPr>
+            </w:r>
+          </w:p>
+        </w:tc>
+        <w:tc>
+          <w:tcPr>
+            <w:tcW w:type="dxa" w:w="850"/>
+          </w:tcPr>
+          <w:p>
+            <w:pPr>
+              <w:jc w:val="left"/>
+            </w:pPr>
+            <w:r>
+              <w:rPr>
+                <w:rFonts w:ascii="Times New Roman" w:hAnsi="Times New Roman" w:eastAsia="Times New Roman"/>
+                <w:b w:val="0"/>
+                <w:i w:val="0"/>
+                <w:color w:val="1A1A2E"/>
+                <w:sz w:val="22"/>
+              </w:rPr>
+            </w:r>
+          </w:p>
+        </w:tc>
+        <w:tc>
+          <w:tcPr>
+            <w:tcW w:type="dxa" w:w="850"/>
+          </w:tcPr>
+          <w:p>
+            <w:pPr>
+              <w:jc w:val="left"/>
+            </w:pPr>
+            <w:r>
+              <w:rPr>
+                <w:rFonts w:ascii="Times New Roman" w:hAnsi="Times New Roman" w:eastAsia="Times New Roman"/>
+                <w:b w:val="0"/>
+                <w:i w:val="0"/>
+                <w:color w:val="1A1A2E"/>
+                <w:sz w:val="22"/>
+              </w:rPr>
+              <w:t>Уровни звука, дБА</w:t>
+            </w:r>
+          </w:p>
+        </w:tc>
+      </w:tr>
+      <w:tr>
+        <w:tc>
+          <w:tcPr>
+            <w:tcW w:type="dxa" w:w="850"/>
+          </w:tcPr>
+          <w:p>
+            <w:pPr>
+              <w:jc w:val="left"/>
+            </w:pPr>
+            <w:r>
+              <w:rPr>
+                <w:rFonts w:ascii="Times New Roman" w:hAnsi="Times New Roman" w:eastAsia="Times New Roman"/>
+                <w:b w:val="0"/>
+                <w:i w:val="0"/>
+                <w:color w:val="1A1A2E"/>
+                <w:sz w:val="22"/>
+              </w:rPr>
+            </w:r>
+          </w:p>
+        </w:tc>
+        <w:tc>
+          <w:tcPr>
+            <w:tcW w:type="dxa" w:w="850"/>
+          </w:tcPr>
+          <w:p>
+            <w:pPr>
+              <w:jc w:val="left"/>
+            </w:pPr>
+            <w:r>
+              <w:rPr>
+                <w:rFonts w:ascii="Times New Roman" w:hAnsi="Times New Roman" w:eastAsia="Times New Roman"/>
+                <w:b w:val="0"/>
+                <w:i w:val="0"/>
+                <w:color w:val="1A1A2E"/>
+                <w:sz w:val="22"/>
+              </w:rPr>
+              <w:t>31,5</w:t>
+            </w:r>
+          </w:p>
+        </w:tc>
+        <w:tc>
+          <w:tcPr>
+            <w:tcW w:type="dxa" w:w="850"/>
+          </w:tcPr>
+          <w:p>
+            <w:pPr>
+              <w:jc w:val="left"/>
+            </w:pPr>
+            <w:r>
+              <w:rPr>
+                <w:rFonts w:ascii="Times New Roman" w:hAnsi="Times New Roman" w:eastAsia="Times New Roman"/>
+                <w:b w:val="0"/>
+                <w:i w:val="0"/>
+                <w:color w:val="1A1A2E"/>
+                <w:sz w:val="22"/>
+              </w:rPr>
+              <w:t>63</w:t>
+            </w:r>
+          </w:p>
+        </w:tc>
+        <w:tc>
+          <w:tcPr>
+            <w:tcW w:type="dxa" w:w="850"/>
+          </w:tcPr>
+          <w:p>
+            <w:pPr>
+              <w:jc w:val="left"/>
+            </w:pPr>
+            <w:r>
+              <w:rPr>
+                <w:rFonts w:ascii="Times New Roman" w:hAnsi="Times New Roman" w:eastAsia="Times New Roman"/>
+                <w:b w:val="0"/>
+                <w:i w:val="0"/>
+                <w:color w:val="1A1A2E"/>
+                <w:sz w:val="22"/>
+              </w:rPr>
+              <w:t>125</w:t>
+            </w:r>
+          </w:p>
+        </w:tc>
+        <w:tc>
+          <w:tcPr>
+            <w:tcW w:type="dxa" w:w="850"/>
+          </w:tcPr>
+          <w:p>
+            <w:pPr>
+              <w:jc w:val="left"/>
+            </w:pPr>
+            <w:r>
+              <w:rPr>
+                <w:rFonts w:ascii="Times New Roman" w:hAnsi="Times New Roman" w:eastAsia="Times New Roman"/>
+                <w:b w:val="0"/>
+                <w:i w:val="0"/>
+                <w:color w:val="1A1A2E"/>
+                <w:sz w:val="22"/>
+              </w:rPr>
+              <w:t>250</w:t>
+            </w:r>
+          </w:p>
+        </w:tc>
+        <w:tc>
+          <w:tcPr>
+            <w:tcW w:type="dxa" w:w="850"/>
+          </w:tcPr>
+          <w:p>
+            <w:pPr>
+              <w:jc w:val="left"/>
+            </w:pPr>
+            <w:r>
+              <w:rPr>
+                <w:rFonts w:ascii="Times New Roman" w:hAnsi="Times New Roman" w:eastAsia="Times New Roman"/>
+                <w:b w:val="0"/>
+                <w:i w:val="0"/>
+                <w:color w:val="1A1A2E"/>
+                <w:sz w:val="22"/>
+              </w:rPr>
+              <w:t>500</w:t>
+            </w:r>
+          </w:p>
+        </w:tc>
+        <w:tc>
+          <w:tcPr>
+            <w:tcW w:type="dxa" w:w="850"/>
+          </w:tcPr>
+          <w:p>
+            <w:pPr>
+              <w:jc w:val="left"/>
+            </w:pPr>
+            <w:r>
+              <w:rPr>
+                <w:rFonts w:ascii="Times New Roman" w:hAnsi="Times New Roman" w:eastAsia="Times New Roman"/>
+                <w:b w:val="0"/>
+                <w:i w:val="0"/>
+                <w:color w:val="1A1A2E"/>
+                <w:sz w:val="22"/>
+              </w:rPr>
+              <w:t>1000</w:t>
+            </w:r>
+          </w:p>
+        </w:tc>
+        <w:tc>
+          <w:tcPr>
+            <w:tcW w:type="dxa" w:w="850"/>
+          </w:tcPr>
+          <w:p>
+            <w:pPr>
+              <w:jc w:val="left"/>
+            </w:pPr>
+            <w:r>
+              <w:rPr>
+                <w:rFonts w:ascii="Times New Roman" w:hAnsi="Times New Roman" w:eastAsia="Times New Roman"/>
+                <w:b w:val="0"/>
+                <w:i w:val="0"/>
+                <w:color w:val="1A1A2E"/>
+                <w:sz w:val="22"/>
+              </w:rPr>
+              <w:t>2000</w:t>
+            </w:r>
+          </w:p>
+        </w:tc>
+        <w:tc>
+          <w:tcPr>
+            <w:tcW w:type="dxa" w:w="850"/>
+          </w:tcPr>
+          <w:p>
+            <w:pPr>
+              <w:jc w:val="left"/>
+            </w:pPr>
+            <w:r>
+              <w:rPr>
+                <w:rFonts w:ascii="Times New Roman" w:hAnsi="Times New Roman" w:eastAsia="Times New Roman"/>
+                <w:b w:val="0"/>
+                <w:i w:val="0"/>
+                <w:color w:val="1A1A2E"/>
+                <w:sz w:val="22"/>
+              </w:rPr>
+              <w:t>4000</w:t>
+            </w:r>
+          </w:p>
+        </w:tc>
+        <w:tc>
+          <w:tcPr>
+            <w:tcW w:type="dxa" w:w="850"/>
+          </w:tcPr>
+          <w:p>
+            <w:pPr>
+              <w:jc w:val="left"/>
+            </w:pPr>
+            <w:r>
+              <w:rPr>
+                <w:rFonts w:ascii="Times New Roman" w:hAnsi="Times New Roman" w:eastAsia="Times New Roman"/>
+                <w:b w:val="0"/>
+                <w:i w:val="0"/>
+                <w:color w:val="1A1A2E"/>
+                <w:sz w:val="22"/>
+              </w:rPr>
+              <w:t>8000</w:t>
+            </w:r>
+          </w:p>
+        </w:tc>
+        <w:tc>
+          <w:tcPr>
+            <w:tcW w:type="dxa" w:w="850"/>
+          </w:tcPr>
+          <w:p>
+            <w:pPr>
+              <w:jc w:val="left"/>
+            </w:pPr>
+            <w:r>
+              <w:rPr>
+                <w:rFonts w:ascii="Times New Roman" w:hAnsi="Times New Roman" w:eastAsia="Times New Roman"/>
+                <w:b w:val="0"/>
+                <w:i w:val="0"/>
+                <w:color w:val="1A1A2E"/>
+                <w:sz w:val="22"/>
+              </w:rPr>
+            </w:r>
+          </w:p>
+        </w:tc>
+      </w:tr>
+      <w:tr>
+        <w:tc>
+          <w:tcPr>
+            <w:tcW w:type="dxa" w:w="850"/>
+          </w:tcPr>
+          <w:p>
+            <w:pPr>
+              <w:jc w:val="left"/>
+            </w:pPr>
+            <w:r>
+              <w:rPr>
+                <w:rFonts w:ascii="Times New Roman" w:hAnsi="Times New Roman" w:eastAsia="Times New Roman"/>
+                <w:b w:val="0"/>
+                <w:i w:val="0"/>
+                <w:color w:val="1A1A2E"/>
+                <w:sz w:val="22"/>
+              </w:rPr>
+              <w:t>Офис ООО «ЛюксонДекор»</w:t>
+            </w:r>
+          </w:p>
+        </w:tc>
+        <w:tc>
+          <w:tcPr>
+            <w:tcW w:type="dxa" w:w="850"/>
+          </w:tcPr>
+          <w:p>
+            <w:pPr>
+              <w:jc w:val="left"/>
+            </w:pPr>
+            <w:r>
+              <w:rPr>
+                <w:rFonts w:ascii="Times New Roman" w:hAnsi="Times New Roman" w:eastAsia="Times New Roman"/>
+                <w:b w:val="0"/>
+                <w:i w:val="0"/>
+                <w:color w:val="1A1A2E"/>
+                <w:sz w:val="22"/>
+              </w:rPr>
+              <w:t>86</w:t>
+            </w:r>
+          </w:p>
+        </w:tc>
+        <w:tc>
+          <w:tcPr>
+            <w:tcW w:type="dxa" w:w="850"/>
+          </w:tcPr>
+          <w:p>
+            <w:pPr>
+              <w:jc w:val="left"/>
+            </w:pPr>
+            <w:r>
+              <w:rPr>
+                <w:rFonts w:ascii="Times New Roman" w:hAnsi="Times New Roman" w:eastAsia="Times New Roman"/>
+                <w:b w:val="0"/>
+                <w:i w:val="0"/>
+                <w:color w:val="1A1A2E"/>
+                <w:sz w:val="22"/>
+              </w:rPr>
+              <w:t>71</w:t>
+            </w:r>
+          </w:p>
+        </w:tc>
+        <w:tc>
+          <w:tcPr>
+            <w:tcW w:type="dxa" w:w="850"/>
+          </w:tcPr>
+          <w:p>
+            <w:pPr>
+              <w:jc w:val="left"/>
+            </w:pPr>
+            <w:r>
+              <w:rPr>
+                <w:rFonts w:ascii="Times New Roman" w:hAnsi="Times New Roman" w:eastAsia="Times New Roman"/>
+                <w:b w:val="0"/>
+                <w:i w:val="0"/>
+                <w:color w:val="1A1A2E"/>
+                <w:sz w:val="22"/>
+              </w:rPr>
+              <w:t>61</w:t>
+            </w:r>
+          </w:p>
+        </w:tc>
+        <w:tc>
+          <w:tcPr>
+            <w:tcW w:type="dxa" w:w="850"/>
+          </w:tcPr>
+          <w:p>
+            <w:pPr>
+              <w:jc w:val="left"/>
+            </w:pPr>
+            <w:r>
+              <w:rPr>
+                <w:rFonts w:ascii="Times New Roman" w:hAnsi="Times New Roman" w:eastAsia="Times New Roman"/>
+                <w:b w:val="0"/>
+                <w:i w:val="0"/>
+                <w:color w:val="1A1A2E"/>
+                <w:sz w:val="22"/>
+              </w:rPr>
+              <w:t>54</w:t>
+            </w:r>
+          </w:p>
+        </w:tc>
+        <w:tc>
+          <w:tcPr>
+            <w:tcW w:type="dxa" w:w="850"/>
+          </w:tcPr>
+          <w:p>
+            <w:pPr>
+              <w:jc w:val="left"/>
+            </w:pPr>
+            <w:r>
+              <w:rPr>
+                <w:rFonts w:ascii="Times New Roman" w:hAnsi="Times New Roman" w:eastAsia="Times New Roman"/>
+                <w:b w:val="0"/>
+                <w:i w:val="0"/>
+                <w:color w:val="1A1A2E"/>
+                <w:sz w:val="22"/>
+              </w:rPr>
+              <w:t>49</w:t>
+            </w:r>
+          </w:p>
+        </w:tc>
+        <w:tc>
+          <w:tcPr>
+            <w:tcW w:type="dxa" w:w="850"/>
+          </w:tcPr>
+          <w:p>
+            <w:pPr>
+              <w:jc w:val="left"/>
+            </w:pPr>
+            <w:r>
+              <w:rPr>
+                <w:rFonts w:ascii="Times New Roman" w:hAnsi="Times New Roman" w:eastAsia="Times New Roman"/>
+                <w:b w:val="0"/>
+                <w:i w:val="0"/>
+                <w:color w:val="1A1A2E"/>
+                <w:sz w:val="22"/>
+              </w:rPr>
+              <w:t>45</w:t>
+            </w:r>
+          </w:p>
+        </w:tc>
+        <w:tc>
+          <w:tcPr>
+            <w:tcW w:type="dxa" w:w="850"/>
+          </w:tcPr>
+          <w:p>
+            <w:pPr>
+              <w:jc w:val="left"/>
+            </w:pPr>
+            <w:r>
+              <w:rPr>
+                <w:rFonts w:ascii="Times New Roman" w:hAnsi="Times New Roman" w:eastAsia="Times New Roman"/>
+                <w:b w:val="0"/>
+                <w:i w:val="0"/>
+                <w:color w:val="1A1A2E"/>
+                <w:sz w:val="22"/>
+              </w:rPr>
+              <w:t>42</w:t>
+            </w:r>
+          </w:p>
+        </w:tc>
+        <w:tc>
+          <w:tcPr>
+            <w:tcW w:type="dxa" w:w="850"/>
+          </w:tcPr>
+          <w:p>
+            <w:pPr>
+              <w:jc w:val="left"/>
+            </w:pPr>
+            <w:r>
+              <w:rPr>
+                <w:rFonts w:ascii="Times New Roman" w:hAnsi="Times New Roman" w:eastAsia="Times New Roman"/>
+                <w:b w:val="0"/>
+                <w:i w:val="0"/>
+                <w:color w:val="1A1A2E"/>
+                <w:sz w:val="22"/>
+              </w:rPr>
+              <w:t>40</w:t>
+            </w:r>
+          </w:p>
+        </w:tc>
+        <w:tc>
+          <w:tcPr>
+            <w:tcW w:type="dxa" w:w="850"/>
+          </w:tcPr>
+          <w:p>
+            <w:pPr>
+              <w:jc w:val="left"/>
+            </w:pPr>
+            <w:r>
+              <w:rPr>
+                <w:rFonts w:ascii="Times New Roman" w:hAnsi="Times New Roman" w:eastAsia="Times New Roman"/>
+                <w:b w:val="0"/>
+                <w:i w:val="0"/>
+                <w:color w:val="1A1A2E"/>
+                <w:sz w:val="22"/>
+              </w:rPr>
+              <w:t>38</w:t>
+            </w:r>
+          </w:p>
+        </w:tc>
+        <w:tc>
+          <w:tcPr>
+            <w:tcW w:type="dxa" w:w="850"/>
+          </w:tcPr>
+          <w:p>
+            <w:pPr>
+              <w:jc w:val="left"/>
+            </w:pPr>
+            <w:r>
+              <w:rPr>
+                <w:rFonts w:ascii="Times New Roman" w:hAnsi="Times New Roman" w:eastAsia="Times New Roman"/>
+                <w:b w:val="0"/>
+                <w:i w:val="0"/>
+                <w:color w:val="1A1A2E"/>
+                <w:sz w:val="22"/>
+              </w:rPr>
+              <w:t>50</w:t>
+            </w:r>
+          </w:p>
+        </w:tc>
+      </w:tr>
+    </w:tbl>
+    <w:p>
+      <w:pPr>
+        <w:spacing w:after="120"/>
+      </w:pPr>
+    </w:p>
+    <w:p>
+      <w:pPr>
+        <w:spacing w:line="360" w:lineRule="auto" w:after="0" w:before="0"/>
+        <w:ind w:firstLine="709"/>
+        <w:jc w:val="both"/>
+      </w:pPr>
+      <w:r>
+        <w:rPr>
+          <w:rFonts w:ascii="Times New Roman" w:hAnsi="Times New Roman" w:eastAsia="Times New Roman"/>
+          <w:b w:val="0"/>
+          <w:i w:val="0"/>
+          <w:color w:val="1A1A2E"/>
+          <w:sz w:val="28"/>
+        </w:rPr>
+        <w:t>Шумящее оборудование (печатающие устройства, серверы и т.п.), уровни шума которого превышают нормативные, должны размещаться вне помещений с ПК.</w:t>
       </w:r>
     </w:p>
     <w:p>
@@ -829,7 +1884,7 @@
           <w:color w:val="1A1A2E"/>
           <w:sz w:val="28"/>
         </w:rPr>
-        <w:t>L(сум) = 10 × lg(Σ(10^(0,1 × Li))),                               (4.4)</w:t>
+        <w:t>L = 10 × lg(Σ 10^(0,1×Li)),                                        (4.4)</w:t>
       </w:r>
     </w:p>
     <w:p>
@@ -846,7 +1901,7 @@
           <w:color w:val="1A1A2E"/>
           <w:sz w:val="28"/>
         </w:rPr>
-        <w:t>где Li — уровень звукового давления i-го источника шума, дБА; n — количество источников шума.</w:t>
+        <w:t>где Li — уровень звукового давления i-го источника шума; n — количество источников шума.</w:t>
       </w:r>
     </w:p>
     <w:p>
@@ -863,7 +1918,7 @@
           <w:color w:val="1A1A2E"/>
           <w:sz w:val="28"/>
         </w:rPr>
-        <w:t>Уровни звукового давления источников шума, действующих на разработчика на его рабочем месте в ООО «ЛюксонДекор», представлены в таблице 4.2.</w:t>
+        <w:t>Полученные результаты расчета сравниваются с допустимым значением уровня шума для данного рабочего места. Уровни звукового давления источников шума, действующих на оператора на его рабочем месте в ООО «ЛюксонДекор», представлены в таблице 4.3.</w:t>
       </w:r>
     </w:p>
     <w:p>
@@ -880,7 +1935,7 @@
           <w:color w:val="1A1A2E"/>
           <w:sz w:val="28"/>
         </w:rPr>
-        <w:t>Таблица 4.2 — Уровни звукового давления различных источников</w:t>
+        <w:t>Таблица 4.3 — Уровни звукового давления различных источников</w:t>
       </w:r>
     </w:p>
     <w:tbl>
@@ -930,7 +1985,7 @@
                 <w:color w:val="1A1A2E"/>
                 <w:sz w:val="22"/>
               </w:rPr>
-              <w:t>Уровень, дБА</w:t>
+              <w:t>Уровень шума, дБ</w:t>
             </w:r>
           </w:p>
         </w:tc>
@@ -952,91 +2007,7 @@
                 <w:color w:val="1A1A2E"/>
                 <w:sz w:val="22"/>
               </w:rPr>
-              <w:t>Системный блок (5 шт)</w:t>
-            </w:r>
-          </w:p>
-        </w:tc>
-        <w:tc>
-          <w:tcPr>
-            <w:tcW w:type="dxa" w:w="4677"/>
-          </w:tcPr>
-          <w:p>
-            <w:pPr>
-              <w:jc w:val="left"/>
-            </w:pPr>
-            <w:r>
-              <w:rPr>
-                <w:rFonts w:ascii="Times New Roman" w:hAnsi="Times New Roman" w:eastAsia="Times New Roman"/>
-                <w:b w:val="0"/>
-                <w:i w:val="0"/>
-                <w:color w:val="1A1A2E"/>
-                <w:sz w:val="22"/>
-              </w:rPr>
-              <w:t>35</w:t>
-            </w:r>
-          </w:p>
-        </w:tc>
-      </w:tr>
-      <w:tr>
-        <w:tc>
-          <w:tcPr>
-            <w:tcW w:type="dxa" w:w="4677"/>
-          </w:tcPr>
-          <w:p>
-            <w:pPr>
-              <w:jc w:val="left"/>
-            </w:pPr>
-            <w:r>
-              <w:rPr>
-                <w:rFonts w:ascii="Times New Roman" w:hAnsi="Times New Roman" w:eastAsia="Times New Roman"/>
-                <w:b w:val="0"/>
-                <w:i w:val="0"/>
-                <w:color w:val="1A1A2E"/>
-                <w:sz w:val="22"/>
-              </w:rPr>
-              <w:t>Монитор (5 шт)</w:t>
-            </w:r>
-          </w:p>
-        </w:tc>
-        <w:tc>
-          <w:tcPr>
-            <w:tcW w:type="dxa" w:w="4677"/>
-          </w:tcPr>
-          <w:p>
-            <w:pPr>
-              <w:jc w:val="left"/>
-            </w:pPr>
-            <w:r>
-              <w:rPr>
-                <w:rFonts w:ascii="Times New Roman" w:hAnsi="Times New Roman" w:eastAsia="Times New Roman"/>
-                <w:b w:val="0"/>
-                <w:i w:val="0"/>
-                <w:color w:val="1A1A2E"/>
-                <w:sz w:val="22"/>
-              </w:rPr>
-              <w:t>30</w:t>
-            </w:r>
-          </w:p>
-        </w:tc>
-      </w:tr>
-      <w:tr>
-        <w:tc>
-          <w:tcPr>
-            <w:tcW w:type="dxa" w:w="4677"/>
-          </w:tcPr>
-          <w:p>
-            <w:pPr>
-              <w:jc w:val="left"/>
-            </w:pPr>
-            <w:r>
-              <w:rPr>
-                <w:rFonts w:ascii="Times New Roman" w:hAnsi="Times New Roman" w:eastAsia="Times New Roman"/>
-                <w:b w:val="0"/>
-                <w:i w:val="0"/>
-                <w:color w:val="1A1A2E"/>
-                <w:sz w:val="22"/>
-              </w:rPr>
-              <w:t>Кондиционер</w:t>
+              <w:t>Жесткий диск</w:t>
             </w:r>
           </w:p>
         </w:tc>
@@ -1078,7 +2049,7 @@
                 <w:color w:val="1A1A2E"/>
                 <w:sz w:val="22"/>
               </w:rPr>
-              <w:t>Люминесцентные лампы (5 шт)</w:t>
+              <w:t>Монитор</w:t>
             </w:r>
           </w:p>
         </w:tc>
@@ -1098,7 +2069,133 @@
                 <w:color w:val="1A1A2E"/>
                 <w:sz w:val="22"/>
               </w:rPr>
-              <w:t>30</w:t>
+              <w:t>17</w:t>
+            </w:r>
+          </w:p>
+        </w:tc>
+      </w:tr>
+      <w:tr>
+        <w:tc>
+          <w:tcPr>
+            <w:tcW w:type="dxa" w:w="4677"/>
+          </w:tcPr>
+          <w:p>
+            <w:pPr>
+              <w:jc w:val="left"/>
+            </w:pPr>
+            <w:r>
+              <w:rPr>
+                <w:rFonts w:ascii="Times New Roman" w:hAnsi="Times New Roman" w:eastAsia="Times New Roman"/>
+                <w:b w:val="0"/>
+                <w:i w:val="0"/>
+                <w:color w:val="1A1A2E"/>
+                <w:sz w:val="22"/>
+              </w:rPr>
+              <w:t>Клавиатура</w:t>
+            </w:r>
+          </w:p>
+        </w:tc>
+        <w:tc>
+          <w:tcPr>
+            <w:tcW w:type="dxa" w:w="4677"/>
+          </w:tcPr>
+          <w:p>
+            <w:pPr>
+              <w:jc w:val="left"/>
+            </w:pPr>
+            <w:r>
+              <w:rPr>
+                <w:rFonts w:ascii="Times New Roman" w:hAnsi="Times New Roman" w:eastAsia="Times New Roman"/>
+                <w:b w:val="0"/>
+                <w:i w:val="0"/>
+                <w:color w:val="1A1A2E"/>
+                <w:sz w:val="22"/>
+              </w:rPr>
+              <w:t>10</w:t>
+            </w:r>
+          </w:p>
+        </w:tc>
+      </w:tr>
+      <w:tr>
+        <w:tc>
+          <w:tcPr>
+            <w:tcW w:type="dxa" w:w="4677"/>
+          </w:tcPr>
+          <w:p>
+            <w:pPr>
+              <w:jc w:val="left"/>
+            </w:pPr>
+            <w:r>
+              <w:rPr>
+                <w:rFonts w:ascii="Times New Roman" w:hAnsi="Times New Roman" w:eastAsia="Times New Roman"/>
+                <w:b w:val="0"/>
+                <w:i w:val="0"/>
+                <w:color w:val="1A1A2E"/>
+                <w:sz w:val="22"/>
+              </w:rPr>
+              <w:t>Принтер</w:t>
+            </w:r>
+          </w:p>
+        </w:tc>
+        <w:tc>
+          <w:tcPr>
+            <w:tcW w:type="dxa" w:w="4677"/>
+          </w:tcPr>
+          <w:p>
+            <w:pPr>
+              <w:jc w:val="left"/>
+            </w:pPr>
+            <w:r>
+              <w:rPr>
+                <w:rFonts w:ascii="Times New Roman" w:hAnsi="Times New Roman" w:eastAsia="Times New Roman"/>
+                <w:b w:val="0"/>
+                <w:i w:val="0"/>
+                <w:color w:val="1A1A2E"/>
+                <w:sz w:val="22"/>
+              </w:rPr>
+              <w:t>45</w:t>
+            </w:r>
+          </w:p>
+        </w:tc>
+      </w:tr>
+      <w:tr>
+        <w:tc>
+          <w:tcPr>
+            <w:tcW w:type="dxa" w:w="4677"/>
+          </w:tcPr>
+          <w:p>
+            <w:pPr>
+              <w:jc w:val="left"/>
+            </w:pPr>
+            <w:r>
+              <w:rPr>
+                <w:rFonts w:ascii="Times New Roman" w:hAnsi="Times New Roman" w:eastAsia="Times New Roman"/>
+                <w:b w:val="0"/>
+                <w:i w:val="0"/>
+                <w:color w:val="1A1A2E"/>
+                <w:sz w:val="22"/>
+              </w:rPr>
+              <w:t>Сканер</w:t>
+            </w:r>
+          </w:p>
+        </w:tc>
+        <w:tc>
+          <w:tcPr>
+            <w:tcW w:type="dxa" w:w="4677"/>
+          </w:tcPr>
+          <w:p>
+            <w:pPr>
+              <w:jc w:val="left"/>
+            </w:pPr>
+            <w:r>
+              <w:rPr>
+                <w:rFonts w:ascii="Times New Roman" w:hAnsi="Times New Roman" w:eastAsia="Times New Roman"/>
+                <w:b w:val="0"/>
+                <w:i w:val="0"/>
+                <w:color w:val="1A1A2E"/>
+                <w:sz w:val="22"/>
+              </w:rPr>
+              <w:t>42</w:t>
             </w:r>
           </w:p>
         </w:tc>
@@ -1140,7 +2237,7 @@
           <w:color w:val="1A1A2E"/>
           <w:sz w:val="28"/>
         </w:rPr>
-        <w:t>L(сум) = 10 × lg(5 × 10^(0,1×35) + 5 × 10^(0,1×30) + 10^(0,1×40) + 5 × 10^(0,1×30)) = 10 × lg(5 × 3162 + 5 × 1000 + 10 000 + 5 × 1000) = 10 × lg(15 810 + 5000 + 10 000 + 5000) = 10 × lg(35 810) = 10 × 4,554 = 45,5 дБА, округляем до 46 дБА.</w:t>
+        <w:t>L = 10 × lg(10^(0,1×40) + 10^(0,1×17) + 10^(0,1×10) + 10^(0,1×45) + 10^(0,1×42)) = 10 × lg(10000 + 50 + 10 + 31623 + 15849) = 10 × lg(57532) = 10 × 4,76 = 47,6 дБА, округляем до 48 дБА.</w:t>
       </w:r>
     </w:p>
     <w:p>
@@ -1157,7 +2254,7 @@
           <w:color w:val="1A1A2E"/>
           <w:sz w:val="28"/>
         </w:rPr>
-        <w:t>Полученное значение 46 дБА не превышает допустимый уровень шума 50 дБА для рабочего места разработчика в офисе ООО «ЛюксонДекор».</w:t>
+        <w:t>Полученное значение 48 дБ не превышает допустимый уровень шума 50 дБА для рабочего места оператора в офисе ООО «ЛюксонДекор».</w:t>
       </w:r>
     </w:p>
     <w:p>
@@ -1174,7 +2271,7 @@
           <w:color w:val="1A1A2E"/>
           <w:sz w:val="28"/>
         </w:rPr>
-        <w:t>Искусственное освещение в помещении эксплуатации ПК ООО «ЛюксонДекор» осуществляется системой общего равномерного освещения. Освещенность на поверхности стола в зоне размещения документа должна быть 300-500 лк.</w:t>
+        <w:t>Искусственное освещение в помещении эксплуатации ПК ООО «ЛюксонДекор» осуществляется системой общего равномерного освещения. Освещенность на поверхности стола должна быть 300-500 лк (Люкс — единица измерения освещенности).</w:t>
       </w:r>
     </w:p>
     <w:p>
@@ -1191,7 +2288,7 @@
           <w:color w:val="1A1A2E"/>
           <w:sz w:val="28"/>
         </w:rPr>
-        <w:t>Расположим светильники параллельно длинной стороне помещения, имеющего: размеры помещения 6 × 5 м; высотой 3 м; площадь помещения S = 6 × 5 = 30 м².</w:t>
+        <w:t>Расположим светильники параллельно длинной стороне помещения, имеющего: размеры помещения 6 × 5 м; высотой 3 м; площадь помещения (по формуле 4.5)</w:t>
       </w:r>
     </w:p>
     <w:p>
@@ -1208,7 +2305,7 @@
           <w:color w:val="1A1A2E"/>
           <w:sz w:val="28"/>
         </w:rPr>
-        <w:t>Светильники расположены в 2 рядах по 3 и 2 светильника (всего 5). Высота рабочих мест составляет 0,75 м, поэтому расчетная высота hр = 3 - 0,75 = 2,25 м.</w:t>
+        <w:t>S = 6 × 5 = 30 м2.                                                 (4.5)</w:t>
       </w:r>
     </w:p>
     <w:p>
@@ -1225,7 +2322,7 @@
           <w:color w:val="1A1A2E"/>
           <w:sz w:val="28"/>
         </w:rPr>
-        <w:t>Световой поток группы ламп светильника найдем по следующей формуле 4.5:</w:t>
+        <w:t>Светильники расположены с зазором в 1,5 м установлены на потолке. Высота рабочих мест составляет 0,75 м, поэтому расчетная высота будет равна 2,25 м.</w:t>
       </w:r>
     </w:p>
     <w:p>
@@ -1242,7 +2339,7 @@
           <w:color w:val="1A1A2E"/>
           <w:sz w:val="28"/>
         </w:rPr>
-        <w:t>F = (Ен × S × Kз × Z) / (N × η),                                   (4.5)</w:t>
+        <w:t>Световой поток группы ламп светильника найдем по следующей формуле 4.6:</w:t>
       </w:r>
     </w:p>
     <w:p>
@@ -1259,7 +2356,7 @@
           <w:color w:val="1A1A2E"/>
           <w:sz w:val="28"/>
         </w:rPr>
-        <w:t>где Ен — требуемый нормативный уровень освещенности рабочей поверхности, Ен = 300 лк; Kз — коэффициент запаса, Kз = 1,5; Z — коэффициент неравномерности освещения, Z = 1,1; N — количество светильников, N = 5; η — коэффициент использования светового потока, η = 0,42.</w:t>
+        <w:t>F = (Eн × S × Kз × Z) / (N × η),                                   (4.6)</w:t>
       </w:r>
     </w:p>
     <w:p>
@@ -1276,7 +2373,7 @@
           <w:color w:val="1A1A2E"/>
           <w:sz w:val="28"/>
         </w:rPr>
-        <w:t>F = (300 × 30 × 1,5 × 1,1) / (5 × 0,42) = 14 850 / 2,1 = 7071 лм.</w:t>
+        <w:t>где Ен — требуемый нормативный уровень освещенности рабочей поверхности. Возьмем Енорм = 300 лк — это наиболее оптимальное значение для данного помещения; Kз = 1,5 — коэффициент запаса, учитывающий запыленность светильников и износ люминесцентных ламп в процессе эксплуатации, при условии чистки светильников не реже 4-х раз в год; Z = 1,1 — коэффициент неравномерности освещения; N — количество светильников; η — коэффициент использования светового потока, η = 0,42.</w:t>
       </w:r>
     </w:p>
     <w:p>
@@ -1293,7 +2390,7 @@
           <w:color w:val="1A1A2E"/>
           <w:sz w:val="28"/>
         </w:rPr>
-        <w:t>Учитывая, что светильник рассчитан на 4 лампы, получим световой поток одной лампы по формуле 4.6:</w:t>
+        <w:t>Количество светильников в помещении можно определить по следующей формуле 4.7:</w:t>
       </w:r>
     </w:p>
     <w:p>
@@ -1310,7 +2407,7 @@
           <w:color w:val="1A1A2E"/>
           <w:sz w:val="28"/>
         </w:rPr>
-        <w:t>F₁ = F / nл = 7071 / 4 = 1768 лм.                                   (4.6)</w:t>
+        <w:t>N = S / (h × h) = 30 / (2,25 × 2,25) ≈ 5,9, принимаем N = 5.      (4.7)</w:t>
       </w:r>
     </w:p>
     <w:p>
@@ -1327,7 +2424,92 @@
           <w:color w:val="1A1A2E"/>
           <w:sz w:val="28"/>
         </w:rPr>
-        <w:t>По найденному значению светового потока можно определить тип и мощность лампы. Этому значению соответствует лампа ЛТБ40 мощностью 40 Вт со световым потоком 2100 лм, что превышает расчетное значение и обеспечивает требуемый уровень освещенности с запасом. В помещении ООО «ЛюксонДекор» установлено 5 светильников с лампами ЛТБ40, что обеспечивает требуемый уровень освещенности 300 лк.</w:t>
+        <w:t>где h — расчетная высота.</w:t>
+      </w:r>
+    </w:p>
+    <w:p>
+      <w:pPr>
+        <w:spacing w:line="360" w:lineRule="auto" w:after="0" w:before="0"/>
+        <w:ind w:firstLine="709"/>
+        <w:jc w:val="both"/>
+      </w:pPr>
+      <w:r>
+        <w:rPr>
+          <w:rFonts w:ascii="Times New Roman" w:hAnsi="Times New Roman" w:eastAsia="Times New Roman"/>
+          <w:b w:val="0"/>
+          <w:i w:val="0"/>
+          <w:color w:val="1A1A2E"/>
+          <w:sz w:val="28"/>
+        </w:rPr>
+        <w:t>Таким образом, можно рассчитать световой поток группы ламп светильника:</w:t>
+      </w:r>
+    </w:p>
+    <w:p>
+      <w:pPr>
+        <w:spacing w:line="360" w:lineRule="auto" w:after="0" w:before="0"/>
+        <w:ind w:firstLine="709"/>
+        <w:jc w:val="both"/>
+      </w:pPr>
+      <w:r>
+        <w:rPr>
+          <w:rFonts w:ascii="Times New Roman" w:hAnsi="Times New Roman" w:eastAsia="Times New Roman"/>
+          <w:b w:val="0"/>
+          <w:i w:val="0"/>
+          <w:color w:val="1A1A2E"/>
+          <w:sz w:val="28"/>
+        </w:rPr>
+        <w:t>F = (300 × 30 × 1,5 × 1,1) / (5 × 0,42) = 14850 / 2,1 = 7071 лм.</w:t>
+      </w:r>
+    </w:p>
+    <w:p>
+      <w:pPr>
+        <w:spacing w:line="360" w:lineRule="auto" w:after="0" w:before="0"/>
+        <w:ind w:firstLine="709"/>
+        <w:jc w:val="both"/>
+      </w:pPr>
+      <w:r>
+        <w:rPr>
+          <w:rFonts w:ascii="Times New Roman" w:hAnsi="Times New Roman" w:eastAsia="Times New Roman"/>
+          <w:b w:val="0"/>
+          <w:i w:val="0"/>
+          <w:color w:val="1A1A2E"/>
+          <w:sz w:val="28"/>
+        </w:rPr>
+        <w:t>Учитывая, что светильник рассчитан на 4 лампы, получим световой поток одной лампы по формуле 4.8:</w:t>
+      </w:r>
+    </w:p>
+    <w:p>
+      <w:pPr>
+        <w:spacing w:line="360" w:lineRule="auto" w:after="0" w:before="0"/>
+        <w:ind w:firstLine="709"/>
+        <w:jc w:val="both"/>
+      </w:pPr>
+      <w:r>
+        <w:rPr>
+          <w:rFonts w:ascii="Times New Roman" w:hAnsi="Times New Roman" w:eastAsia="Times New Roman"/>
+          <w:b w:val="0"/>
+          <w:i w:val="0"/>
+          <w:color w:val="1A1A2E"/>
+          <w:sz w:val="28"/>
+        </w:rPr>
+        <w:t>F1 = F / 4 = 7071 / 4 = 1768 лм.                                    (4.8)</w:t>
+      </w:r>
+    </w:p>
+    <w:p>
+      <w:pPr>
+        <w:spacing w:line="360" w:lineRule="auto" w:after="0" w:before="0"/>
+        <w:ind w:firstLine="709"/>
+        <w:jc w:val="both"/>
+      </w:pPr>
+      <w:r>
+        <w:rPr>
+          <w:rFonts w:ascii="Times New Roman" w:hAnsi="Times New Roman" w:eastAsia="Times New Roman"/>
+          <w:b w:val="0"/>
+          <w:i w:val="0"/>
+          <w:color w:val="1A1A2E"/>
+          <w:sz w:val="28"/>
+        </w:rPr>
+        <w:t>По найденному значению светового потока можно определить тип и мощность лампы. Этому значению соответствует лампа ЛТБ40 мощностью 40 Вт со световым потоком 2100 лм. В помещении ООО «ЛюксонДекор» установлено 5 светильников с лампами ЛТБ40, что обеспечивает требуемый уровень освещенности 300 лк.</w:t>
       </w:r>
     </w:p>
     <w:p>
@@ -1376,7 +2558,7 @@
           <w:color w:val="1A1A2E"/>
           <w:sz w:val="28"/>
         </w:rPr>
-        <w:t>В офисе ООО «ЛюксонДекор» соблюдены все регламентированные указания для обустройства рабочих мест: расстояние между боковыми поверхностями смежных видеомониторов — не менее 1,2 м; расстояние между экраном монитора и задней стенкой соседнего монитора — не менее 1,0 м; габариты столов соответствуют техническим нормам (ширина не менее 700 мм, глубина не менее 600 мм).</w:t>
+        <w:t>В офисе ООО «ЛюксонДекор» соблюдены все регламентированные указания для обустройства рабочих мест: расстояние между столами сотрудников, удаление оргтехники от стен и других предметов, габариты столов соответствуют техническим нормам.</w:t>
       </w:r>
     </w:p>
     <w:p>
@@ -1393,7 +2575,7 @@
           <w:color w:val="1A1A2E"/>
           <w:sz w:val="28"/>
         </w:rPr>
-        <w:t>Разнообразная оргтехника — компьютеры, принтеры, сетевое оборудование — работает от электричества, следовательно, всегда является источником возможного поражения током. В офисе ООО «ЛюксонДекор» уделяют внимание всем составляющим электробезопасности: контроль за состоянием проводки, розеток, вилок, выключателей; заземление всех металлических корпусов оборудования; использование устройств защитного отключения (УЗО); контроль и регулярная модернизация технической базы.</w:t>
+        <w:t>Разнообразная оргтехника — компьютеры, копиры, принтеры и т.д. — работает от электричества. Следовательно, всегда является источником возможного поражения током. В офисе ООО «ЛюксонДекор» уделяют внимание всем составляющим электробезопасности: контроль за состоянием проводки, розеток, вилок, выключателей; контроль и регулярная модернизация технической базы.</w:t>
       </w:r>
     </w:p>
     <w:p>
@@ -1410,7 +2592,7 @@
           <w:color w:val="1A1A2E"/>
           <w:sz w:val="28"/>
         </w:rPr>
-        <w:t>Правила техники безопасности, которые применяются в офисе ООО «ЛюксонДекор»: эксплуатация техники только по рекомендациям производителя; ограничение нагрузки на электрическую сеть; отключение приборов после работы.</w:t>
+        <w:t>Правила техники безопасности, которые применяются в офисе ООО «ЛюксонДекор», достаточно просты: эксплуатация техники только по рекомендациям производителя; ограничение нагрузки на электрическую сеть; отключение приборов после работы.</w:t>
       </w:r>
     </w:p>
     <w:p>
@@ -1427,7 +2609,7 @@
           <w:color w:val="1A1A2E"/>
           <w:sz w:val="28"/>
         </w:rPr>
-        <w:t>Режим работы сотрудников ООО «ЛюксонДекор»: продолжительность рабочего дня 8 часов, начало в 9:00, окончание в 18:00, перерыв на обед с 13:00 до 14:00, дополнительные регламентированные перерывы по 15 минут через каждый час работы с ПК.</w:t>
+        <w:t>Режим работы всех офисных сотрудников ООО «ЛюксонДекор» одинаковый: продолжительность рабочего дня 8 часов, начало в 9.00, окончание в 18.00, перерыв на обед с 13.00 до 14.00.</w:t>
       </w:r>
     </w:p>
     <w:p>
@@ -1444,7 +2626,7 @@
           <w:color w:val="1A1A2E"/>
           <w:sz w:val="28"/>
         </w:rPr>
-        <w:t>В офисном помещении предусмотрена зона для приема пищи, организованы предварительные и периодические медицинские осмотры работников, позволяющие своевременно выявлять симптомы профзаболеваний: в помещениях, оборудованных ПК, проводятся ежедневные влажные уборки, систематическое проветривание после каждого часа работы; офис ООО «ЛюксонДекор» оборудован приточно-вытяжной вентиляцией; в офисе есть аптечка для оказания первой помощи.</w:t>
+        <w:t>В офисном помещении предусмотрено помещение для приема пищи (зона отдыха), а также организованы предварительные и периодические медицинские осмотры работников, позволяющие своевременно выявлять симптомы профзаболеваний. в помещениях, оборудованных ПК, проводятся ежедневные влажные уборки, систематическое проветривание после каждого часа работы; офис ООО «ЛюксонДекор» оборудован приточно-вытяжной вентиляцией; в офисе есть в наличии аптечка для оказания первой помощи.</w:t>
       </w:r>
     </w:p>
     <w:p>
@@ -1461,7 +2643,7 @@
           <w:color w:val="1A1A2E"/>
           <w:sz w:val="28"/>
         </w:rPr>
-        <w:t>Конструкция рабочего стола обеспечивает возможность размещения на рабочей поверхности системного блока, монитора, клавиатуры, мыши и документов с учетом характера выполняемой работы по разработке прикладных решений на платформе «1С:Предприятие».</w:t>
+        <w:t>Конструкция рабочего стола должна обеспечивать возможность размещения на рабочей поверхности необходимого комплекта оборудования и документов с учетом характера выполняемой работы.</w:t>
       </w:r>
     </w:p>
     <w:p>
@@ -1478,7 +2660,7 @@
           <w:color w:val="1A1A2E"/>
           <w:sz w:val="28"/>
         </w:rPr>
-        <w:t>Рабочий стул (кресло) обеспечивает поддержание физиологически рациональной рабочей позы оператора: спинка кресла регулируется по высоте и углу наклона, сиденье — по высоте, подлокотники — по высоте и расстоянию между ними.</w:t>
+        <w:t>Рабочий стул (кресло) должен обеспечивать поддержание физиологически рациональной рабочей позы оператора в процессе трудовой деятельности.</w:t>
       </w:r>
     </w:p>
     <w:p>
@@ -1495,7 +2677,7 @@
           <w:color w:val="1A1A2E"/>
           <w:sz w:val="28"/>
         </w:rPr>
-        <w:t>Клавиатура на рабочем месте разработчика располагается на поверхности стола на расстоянии 100-300 мм от переднего края, что обеспечивает оптимальное положение рук и снижение напряжения мышц предплечья.</w:t>
+        <w:t>Клавиатура на рабочем месте оператора должна располагаться так, чтобы обеспечивать оптимальную видимость экрана. Клавиатура должна иметь возможность свободного перемещения и располагать на поверхности стола на расстоянии от 100 до 300 мм от переднего края.</w:t>
       </w:r>
     </w:p>
     <w:p>
@@ -1512,7 +2694,7 @@
           <w:color w:val="1A1A2E"/>
           <w:sz w:val="28"/>
         </w:rPr>
-        <w:t>Результаты анализа условий труда в офисе ООО «ЛюксонДекор» сведены в таблицу 4.3.</w:t>
+        <w:t>Определенные характеристики клавиатуры могут влиять на осанку, принимаемую оператором, работающим с видеотерминалом.</w:t>
       </w:r>
     </w:p>
     <w:p>
@@ -1529,7 +2711,41 @@
           <w:color w:val="1A1A2E"/>
           <w:sz w:val="28"/>
         </w:rPr>
-        <w:t>Таблица 4.3 — Результаты анализа условий труда</w:t>
+        <w:t>Пригодность является удовлетворительной, если пользователи при применении клавиатуры для выполнения производственного задания могут достигать необходимого уровня функциональных характеристик при приемлемом уровне рабочего напряжения и комфорта.</w:t>
+      </w:r>
+    </w:p>
+    <w:p>
+      <w:pPr>
+        <w:spacing w:line="360" w:lineRule="auto" w:after="0" w:before="0"/>
+        <w:ind w:firstLine="709"/>
+        <w:jc w:val="both"/>
+      </w:pPr>
+      <w:r>
+        <w:rPr>
+          <w:rFonts w:ascii="Times New Roman" w:hAnsi="Times New Roman" w:eastAsia="Times New Roman"/>
+          <w:b w:val="0"/>
+          <w:i w:val="0"/>
+          <w:color w:val="1A1A2E"/>
+          <w:sz w:val="28"/>
+        </w:rPr>
+        <w:t>Результаты анализа условий труда в офисе ООО «ЛюксонДекор» сведены в таблицу 4.4.</w:t>
+      </w:r>
+    </w:p>
+    <w:p>
+      <w:pPr>
+        <w:spacing w:line="360" w:lineRule="auto" w:after="0" w:before="0"/>
+        <w:ind w:firstLine="709"/>
+        <w:jc w:val="both"/>
+      </w:pPr>
+      <w:r>
+        <w:rPr>
+          <w:rFonts w:ascii="Times New Roman" w:hAnsi="Times New Roman" w:eastAsia="Times New Roman"/>
+          <w:b w:val="0"/>
+          <w:i w:val="0"/>
+          <w:color w:val="1A1A2E"/>
+          <w:sz w:val="28"/>
+        </w:rPr>
+        <w:t>Таблица 4.4 — Результаты анализа условий труда</w:t>
       </w:r>
     </w:p>
     <w:tbl>
@@ -1539,15 +2755,16 @@
         <w:tblLook w:firstColumn="1" w:firstRow="1" w:lastColumn="0" w:lastRow="0" w:noHBand="0" w:noVBand="1" w:val="04A0"/>
       </w:tblPr>
       <w:tblGrid>
-        <w:gridCol w:w="2339"/>
-        <w:gridCol w:w="2339"/>
-        <w:gridCol w:w="2339"/>
-        <w:gridCol w:w="2339"/>
+        <w:gridCol w:w="1871"/>
+        <w:gridCol w:w="1871"/>
+        <w:gridCol w:w="1871"/>
+        <w:gridCol w:w="1871"/>
+        <w:gridCol w:w="1871"/>
       </w:tblGrid>
       <w:tr>
         <w:tc>
           <w:tcPr>
-            <w:tcW w:type="dxa" w:w="2339"/>
+            <w:tcW w:type="dxa" w:w="1871"/>
           </w:tcPr>
           <w:p>
             <w:pPr>
@@ -1561,13 +2778,13 @@
                 <w:color w:val="1A1A2E"/>
                 <w:sz w:val="22"/>
               </w:rPr>
-              <w:t>Фактор</w:t>
+              <w:t>Факторы условий труда</w:t>
             </w:r>
           </w:p>
         </w:tc>
         <w:tc>
           <w:tcPr>
-            <w:tcW w:type="dxa" w:w="2339"/>
+            <w:tcW w:type="dxa" w:w="1871"/>
           </w:tcPr>
           <w:p>
             <w:pPr>
@@ -1581,13 +2798,13 @@
                 <w:color w:val="1A1A2E"/>
                 <w:sz w:val="22"/>
               </w:rPr>
-              <w:t>Норматив</w:t>
+              <w:t>Единицы измерения</w:t>
             </w:r>
           </w:p>
         </w:tc>
         <w:tc>
           <w:tcPr>
-            <w:tcW w:type="dxa" w:w="2339"/>
+            <w:tcW w:type="dxa" w:w="1871"/>
           </w:tcPr>
           <w:p>
             <w:pPr>
@@ -1601,13 +2818,13 @@
                 <w:color w:val="1A1A2E"/>
                 <w:sz w:val="22"/>
               </w:rPr>
-              <w:t>Фактическое значение</w:t>
+              <w:t>Нормативное значение</w:t>
             </w:r>
           </w:p>
         </w:tc>
         <w:tc>
           <w:tcPr>
-            <w:tcW w:type="dxa" w:w="2339"/>
+            <w:tcW w:type="dxa" w:w="1871"/>
           </w:tcPr>
           <w:p>
             <w:pPr>
@@ -1621,15 +2838,13 @@
                 <w:color w:val="1A1A2E"/>
                 <w:sz w:val="22"/>
               </w:rPr>
-              <w:t>Соответствие</w:t>
+              <w:t>Измеренное значение</w:t>
             </w:r>
           </w:p>
         </w:tc>
-      </w:tr>
-      <w:tr>
         <w:tc>
           <w:tcPr>
-            <w:tcW w:type="dxa" w:w="2339"/>
+            <w:tcW w:type="dxa" w:w="1871"/>
           </w:tcPr>
           <w:p>
             <w:pPr>
@@ -1643,13 +2858,15 @@
                 <w:color w:val="1A1A2E"/>
                 <w:sz w:val="22"/>
               </w:rPr>
-              <w:t>Температура воздуха, С</w:t>
+              <w:t>Заключение соответствий</w:t>
             </w:r>
           </w:p>
         </w:tc>
+      </w:tr>
+      <w:tr>
         <w:tc>
           <w:tcPr>
-            <w:tcW w:type="dxa" w:w="2339"/>
+            <w:tcW w:type="dxa" w:w="1871"/>
           </w:tcPr>
           <w:p>
             <w:pPr>
@@ -1663,13 +2880,971 @@
                 <w:color w:val="1A1A2E"/>
                 <w:sz w:val="22"/>
               </w:rPr>
-              <w:t>22-24</w:t>
+              <w:t>Коэффициент естеств. освещенности</w:t>
             </w:r>
           </w:p>
         </w:tc>
         <w:tc>
           <w:tcPr>
-            <w:tcW w:type="dxa" w:w="2339"/>
+            <w:tcW w:type="dxa" w:w="1871"/>
+          </w:tcPr>
+          <w:p>
+            <w:pPr>
+              <w:jc w:val="left"/>
+            </w:pPr>
+            <w:r>
+              <w:rPr>
+                <w:rFonts w:ascii="Times New Roman" w:hAnsi="Times New Roman" w:eastAsia="Times New Roman"/>
+                <w:b w:val="0"/>
+                <w:i w:val="0"/>
+                <w:color w:val="1A1A2E"/>
+                <w:sz w:val="22"/>
+              </w:rPr>
+              <w:t>%</w:t>
+            </w:r>
+          </w:p>
+        </w:tc>
+        <w:tc>
+          <w:tcPr>
+            <w:tcW w:type="dxa" w:w="1871"/>
+          </w:tcPr>
+          <w:p>
+            <w:pPr>
+              <w:jc w:val="left"/>
+            </w:pPr>
+            <w:r>
+              <w:rPr>
+                <w:rFonts w:ascii="Times New Roman" w:hAnsi="Times New Roman" w:eastAsia="Times New Roman"/>
+                <w:b w:val="0"/>
+                <w:i w:val="0"/>
+                <w:color w:val="1A1A2E"/>
+                <w:sz w:val="22"/>
+              </w:rPr>
+              <w:t>1,5</w:t>
+            </w:r>
+          </w:p>
+        </w:tc>
+        <w:tc>
+          <w:tcPr>
+            <w:tcW w:type="dxa" w:w="1871"/>
+          </w:tcPr>
+          <w:p>
+            <w:pPr>
+              <w:jc w:val="left"/>
+            </w:pPr>
+            <w:r>
+              <w:rPr>
+                <w:rFonts w:ascii="Times New Roman" w:hAnsi="Times New Roman" w:eastAsia="Times New Roman"/>
+                <w:b w:val="0"/>
+                <w:i w:val="0"/>
+                <w:color w:val="1A1A2E"/>
+                <w:sz w:val="22"/>
+              </w:rPr>
+              <w:t>5</w:t>
+            </w:r>
+          </w:p>
+        </w:tc>
+        <w:tc>
+          <w:tcPr>
+            <w:tcW w:type="dxa" w:w="1871"/>
+          </w:tcPr>
+          <w:p>
+            <w:pPr>
+              <w:jc w:val="left"/>
+            </w:pPr>
+            <w:r>
+              <w:rPr>
+                <w:rFonts w:ascii="Times New Roman" w:hAnsi="Times New Roman" w:eastAsia="Times New Roman"/>
+                <w:b w:val="0"/>
+                <w:i w:val="0"/>
+                <w:color w:val="1A1A2E"/>
+                <w:sz w:val="22"/>
+              </w:rPr>
+              <w:t>соответствует</w:t>
+            </w:r>
+          </w:p>
+        </w:tc>
+      </w:tr>
+      <w:tr>
+        <w:tc>
+          <w:tcPr>
+            <w:tcW w:type="dxa" w:w="1871"/>
+          </w:tcPr>
+          <w:p>
+            <w:pPr>
+              <w:jc w:val="left"/>
+            </w:pPr>
+            <w:r>
+              <w:rPr>
+                <w:rFonts w:ascii="Times New Roman" w:hAnsi="Times New Roman" w:eastAsia="Times New Roman"/>
+                <w:b w:val="0"/>
+                <w:i w:val="0"/>
+                <w:color w:val="1A1A2E"/>
+                <w:sz w:val="22"/>
+              </w:rPr>
+              <w:t>Ориентация светопроемов</w:t>
+            </w:r>
+          </w:p>
+        </w:tc>
+        <w:tc>
+          <w:tcPr>
+            <w:tcW w:type="dxa" w:w="1871"/>
+          </w:tcPr>
+          <w:p>
+            <w:pPr>
+              <w:jc w:val="left"/>
+            </w:pPr>
+            <w:r>
+              <w:rPr>
+                <w:rFonts w:ascii="Times New Roman" w:hAnsi="Times New Roman" w:eastAsia="Times New Roman"/>
+                <w:b w:val="0"/>
+                <w:i w:val="0"/>
+                <w:color w:val="1A1A2E"/>
+                <w:sz w:val="22"/>
+              </w:rPr>
+              <w:t>-</w:t>
+            </w:r>
+          </w:p>
+        </w:tc>
+        <w:tc>
+          <w:tcPr>
+            <w:tcW w:type="dxa" w:w="1871"/>
+          </w:tcPr>
+          <w:p>
+            <w:pPr>
+              <w:jc w:val="left"/>
+            </w:pPr>
+            <w:r>
+              <w:rPr>
+                <w:rFonts w:ascii="Times New Roman" w:hAnsi="Times New Roman" w:eastAsia="Times New Roman"/>
+                <w:b w:val="0"/>
+                <w:i w:val="0"/>
+                <w:color w:val="1A1A2E"/>
+                <w:sz w:val="22"/>
+              </w:rPr>
+              <w:t>север, северо-восток</w:t>
+            </w:r>
+          </w:p>
+        </w:tc>
+        <w:tc>
+          <w:tcPr>
+            <w:tcW w:type="dxa" w:w="1871"/>
+          </w:tcPr>
+          <w:p>
+            <w:pPr>
+              <w:jc w:val="left"/>
+            </w:pPr>
+            <w:r>
+              <w:rPr>
+                <w:rFonts w:ascii="Times New Roman" w:hAnsi="Times New Roman" w:eastAsia="Times New Roman"/>
+                <w:b w:val="0"/>
+                <w:i w:val="0"/>
+                <w:color w:val="1A1A2E"/>
+                <w:sz w:val="22"/>
+              </w:rPr>
+              <w:t>северо-восток</w:t>
+            </w:r>
+          </w:p>
+        </w:tc>
+        <w:tc>
+          <w:tcPr>
+            <w:tcW w:type="dxa" w:w="1871"/>
+          </w:tcPr>
+          <w:p>
+            <w:pPr>
+              <w:jc w:val="left"/>
+            </w:pPr>
+            <w:r>
+              <w:rPr>
+                <w:rFonts w:ascii="Times New Roman" w:hAnsi="Times New Roman" w:eastAsia="Times New Roman"/>
+                <w:b w:val="0"/>
+                <w:i w:val="0"/>
+                <w:color w:val="1A1A2E"/>
+                <w:sz w:val="22"/>
+              </w:rPr>
+              <w:t>соответствует</w:t>
+            </w:r>
+          </w:p>
+        </w:tc>
+      </w:tr>
+      <w:tr>
+        <w:tc>
+          <w:tcPr>
+            <w:tcW w:type="dxa" w:w="1871"/>
+          </w:tcPr>
+          <w:p>
+            <w:pPr>
+              <w:jc w:val="left"/>
+            </w:pPr>
+            <w:r>
+              <w:rPr>
+                <w:rFonts w:ascii="Times New Roman" w:hAnsi="Times New Roman" w:eastAsia="Times New Roman"/>
+                <w:b w:val="0"/>
+                <w:i w:val="0"/>
+                <w:color w:val="1A1A2E"/>
+                <w:sz w:val="22"/>
+              </w:rPr>
+              <w:t>Падение естеств. света</w:t>
+            </w:r>
+          </w:p>
+        </w:tc>
+        <w:tc>
+          <w:tcPr>
+            <w:tcW w:type="dxa" w:w="1871"/>
+          </w:tcPr>
+          <w:p>
+            <w:pPr>
+              <w:jc w:val="left"/>
+            </w:pPr>
+            <w:r>
+              <w:rPr>
+                <w:rFonts w:ascii="Times New Roman" w:hAnsi="Times New Roman" w:eastAsia="Times New Roman"/>
+                <w:b w:val="0"/>
+                <w:i w:val="0"/>
+                <w:color w:val="1A1A2E"/>
+                <w:sz w:val="22"/>
+              </w:rPr>
+              <w:t>-</w:t>
+            </w:r>
+          </w:p>
+        </w:tc>
+        <w:tc>
+          <w:tcPr>
+            <w:tcW w:type="dxa" w:w="1871"/>
+          </w:tcPr>
+          <w:p>
+            <w:pPr>
+              <w:jc w:val="left"/>
+            </w:pPr>
+            <w:r>
+              <w:rPr>
+                <w:rFonts w:ascii="Times New Roman" w:hAnsi="Times New Roman" w:eastAsia="Times New Roman"/>
+                <w:b w:val="0"/>
+                <w:i w:val="0"/>
+                <w:color w:val="1A1A2E"/>
+                <w:sz w:val="22"/>
+              </w:rPr>
+              <w:t>слева</w:t>
+            </w:r>
+          </w:p>
+        </w:tc>
+        <w:tc>
+          <w:tcPr>
+            <w:tcW w:type="dxa" w:w="1871"/>
+          </w:tcPr>
+          <w:p>
+            <w:pPr>
+              <w:jc w:val="left"/>
+            </w:pPr>
+            <w:r>
+              <w:rPr>
+                <w:rFonts w:ascii="Times New Roman" w:hAnsi="Times New Roman" w:eastAsia="Times New Roman"/>
+                <w:b w:val="0"/>
+                <w:i w:val="0"/>
+                <w:color w:val="1A1A2E"/>
+                <w:sz w:val="22"/>
+              </w:rPr>
+              <w:t>слева</w:t>
+            </w:r>
+          </w:p>
+        </w:tc>
+        <w:tc>
+          <w:tcPr>
+            <w:tcW w:type="dxa" w:w="1871"/>
+          </w:tcPr>
+          <w:p>
+            <w:pPr>
+              <w:jc w:val="left"/>
+            </w:pPr>
+            <w:r>
+              <w:rPr>
+                <w:rFonts w:ascii="Times New Roman" w:hAnsi="Times New Roman" w:eastAsia="Times New Roman"/>
+                <w:b w:val="0"/>
+                <w:i w:val="0"/>
+                <w:color w:val="1A1A2E"/>
+                <w:sz w:val="22"/>
+              </w:rPr>
+              <w:t>соответствует</w:t>
+            </w:r>
+          </w:p>
+        </w:tc>
+      </w:tr>
+      <w:tr>
+        <w:tc>
+          <w:tcPr>
+            <w:tcW w:type="dxa" w:w="1871"/>
+          </w:tcPr>
+          <w:p>
+            <w:pPr>
+              <w:jc w:val="left"/>
+            </w:pPr>
+            <w:r>
+              <w:rPr>
+                <w:rFonts w:ascii="Times New Roman" w:hAnsi="Times New Roman" w:eastAsia="Times New Roman"/>
+                <w:b w:val="0"/>
+                <w:i w:val="0"/>
+                <w:color w:val="1A1A2E"/>
+                <w:sz w:val="22"/>
+              </w:rPr>
+              <w:t>Высота помещения</w:t>
+            </w:r>
+          </w:p>
+        </w:tc>
+        <w:tc>
+          <w:tcPr>
+            <w:tcW w:type="dxa" w:w="1871"/>
+          </w:tcPr>
+          <w:p>
+            <w:pPr>
+              <w:jc w:val="left"/>
+            </w:pPr>
+            <w:r>
+              <w:rPr>
+                <w:rFonts w:ascii="Times New Roman" w:hAnsi="Times New Roman" w:eastAsia="Times New Roman"/>
+                <w:b w:val="0"/>
+                <w:i w:val="0"/>
+                <w:color w:val="1A1A2E"/>
+                <w:sz w:val="22"/>
+              </w:rPr>
+              <w:t>м</w:t>
+            </w:r>
+          </w:p>
+        </w:tc>
+        <w:tc>
+          <w:tcPr>
+            <w:tcW w:type="dxa" w:w="1871"/>
+          </w:tcPr>
+          <w:p>
+            <w:pPr>
+              <w:jc w:val="left"/>
+            </w:pPr>
+            <w:r>
+              <w:rPr>
+                <w:rFonts w:ascii="Times New Roman" w:hAnsi="Times New Roman" w:eastAsia="Times New Roman"/>
+                <w:b w:val="0"/>
+                <w:i w:val="0"/>
+                <w:color w:val="1A1A2E"/>
+                <w:sz w:val="22"/>
+              </w:rPr>
+              <w:t>3</w:t>
+            </w:r>
+          </w:p>
+        </w:tc>
+        <w:tc>
+          <w:tcPr>
+            <w:tcW w:type="dxa" w:w="1871"/>
+          </w:tcPr>
+          <w:p>
+            <w:pPr>
+              <w:jc w:val="left"/>
+            </w:pPr>
+            <w:r>
+              <w:rPr>
+                <w:rFonts w:ascii="Times New Roman" w:hAnsi="Times New Roman" w:eastAsia="Times New Roman"/>
+                <w:b w:val="0"/>
+                <w:i w:val="0"/>
+                <w:color w:val="1A1A2E"/>
+                <w:sz w:val="22"/>
+              </w:rPr>
+              <w:t>3</w:t>
+            </w:r>
+          </w:p>
+        </w:tc>
+        <w:tc>
+          <w:tcPr>
+            <w:tcW w:type="dxa" w:w="1871"/>
+          </w:tcPr>
+          <w:p>
+            <w:pPr>
+              <w:jc w:val="left"/>
+            </w:pPr>
+            <w:r>
+              <w:rPr>
+                <w:rFonts w:ascii="Times New Roman" w:hAnsi="Times New Roman" w:eastAsia="Times New Roman"/>
+                <w:b w:val="0"/>
+                <w:i w:val="0"/>
+                <w:color w:val="1A1A2E"/>
+                <w:sz w:val="22"/>
+              </w:rPr>
+              <w:t>соответствует</w:t>
+            </w:r>
+          </w:p>
+        </w:tc>
+      </w:tr>
+      <w:tr>
+        <w:tc>
+          <w:tcPr>
+            <w:tcW w:type="dxa" w:w="1871"/>
+          </w:tcPr>
+          <w:p>
+            <w:pPr>
+              <w:jc w:val="left"/>
+            </w:pPr>
+            <w:r>
+              <w:rPr>
+                <w:rFonts w:ascii="Times New Roman" w:hAnsi="Times New Roman" w:eastAsia="Times New Roman"/>
+                <w:b w:val="0"/>
+                <w:i w:val="0"/>
+                <w:color w:val="1A1A2E"/>
+                <w:sz w:val="22"/>
+              </w:rPr>
+              <w:t>Площадь на одно раб. место</w:t>
+            </w:r>
+          </w:p>
+        </w:tc>
+        <w:tc>
+          <w:tcPr>
+            <w:tcW w:type="dxa" w:w="1871"/>
+          </w:tcPr>
+          <w:p>
+            <w:pPr>
+              <w:jc w:val="left"/>
+            </w:pPr>
+            <w:r>
+              <w:rPr>
+                <w:rFonts w:ascii="Times New Roman" w:hAnsi="Times New Roman" w:eastAsia="Times New Roman"/>
+                <w:b w:val="0"/>
+                <w:i w:val="0"/>
+                <w:color w:val="1A1A2E"/>
+                <w:sz w:val="22"/>
+              </w:rPr>
+              <w:t>кв.м</w:t>
+            </w:r>
+          </w:p>
+        </w:tc>
+        <w:tc>
+          <w:tcPr>
+            <w:tcW w:type="dxa" w:w="1871"/>
+          </w:tcPr>
+          <w:p>
+            <w:pPr>
+              <w:jc w:val="left"/>
+            </w:pPr>
+            <w:r>
+              <w:rPr>
+                <w:rFonts w:ascii="Times New Roman" w:hAnsi="Times New Roman" w:eastAsia="Times New Roman"/>
+                <w:b w:val="0"/>
+                <w:i w:val="0"/>
+                <w:color w:val="1A1A2E"/>
+                <w:sz w:val="22"/>
+              </w:rPr>
+              <w:t>6</w:t>
+            </w:r>
+          </w:p>
+        </w:tc>
+        <w:tc>
+          <w:tcPr>
+            <w:tcW w:type="dxa" w:w="1871"/>
+          </w:tcPr>
+          <w:p>
+            <w:pPr>
+              <w:jc w:val="left"/>
+            </w:pPr>
+            <w:r>
+              <w:rPr>
+                <w:rFonts w:ascii="Times New Roman" w:hAnsi="Times New Roman" w:eastAsia="Times New Roman"/>
+                <w:b w:val="0"/>
+                <w:i w:val="0"/>
+                <w:color w:val="1A1A2E"/>
+                <w:sz w:val="22"/>
+              </w:rPr>
+              <w:t>6</w:t>
+            </w:r>
+          </w:p>
+        </w:tc>
+        <w:tc>
+          <w:tcPr>
+            <w:tcW w:type="dxa" w:w="1871"/>
+          </w:tcPr>
+          <w:p>
+            <w:pPr>
+              <w:jc w:val="left"/>
+            </w:pPr>
+            <w:r>
+              <w:rPr>
+                <w:rFonts w:ascii="Times New Roman" w:hAnsi="Times New Roman" w:eastAsia="Times New Roman"/>
+                <w:b w:val="0"/>
+                <w:i w:val="0"/>
+                <w:color w:val="1A1A2E"/>
+                <w:sz w:val="22"/>
+              </w:rPr>
+              <w:t>соответствует</w:t>
+            </w:r>
+          </w:p>
+        </w:tc>
+      </w:tr>
+      <w:tr>
+        <w:tc>
+          <w:tcPr>
+            <w:tcW w:type="dxa" w:w="1871"/>
+          </w:tcPr>
+          <w:p>
+            <w:pPr>
+              <w:jc w:val="left"/>
+            </w:pPr>
+            <w:r>
+              <w:rPr>
+                <w:rFonts w:ascii="Times New Roman" w:hAnsi="Times New Roman" w:eastAsia="Times New Roman"/>
+                <w:b w:val="0"/>
+                <w:i w:val="0"/>
+                <w:color w:val="1A1A2E"/>
+                <w:sz w:val="22"/>
+              </w:rPr>
+              <w:t>Объем на одно рабочее место</w:t>
+            </w:r>
+          </w:p>
+        </w:tc>
+        <w:tc>
+          <w:tcPr>
+            <w:tcW w:type="dxa" w:w="1871"/>
+          </w:tcPr>
+          <w:p>
+            <w:pPr>
+              <w:jc w:val="left"/>
+            </w:pPr>
+            <w:r>
+              <w:rPr>
+                <w:rFonts w:ascii="Times New Roman" w:hAnsi="Times New Roman" w:eastAsia="Times New Roman"/>
+                <w:b w:val="0"/>
+                <w:i w:val="0"/>
+                <w:color w:val="1A1A2E"/>
+                <w:sz w:val="22"/>
+              </w:rPr>
+              <w:t>куб.м</w:t>
+            </w:r>
+          </w:p>
+        </w:tc>
+        <w:tc>
+          <w:tcPr>
+            <w:tcW w:type="dxa" w:w="1871"/>
+          </w:tcPr>
+          <w:p>
+            <w:pPr>
+              <w:jc w:val="left"/>
+            </w:pPr>
+            <w:r>
+              <w:rPr>
+                <w:rFonts w:ascii="Times New Roman" w:hAnsi="Times New Roman" w:eastAsia="Times New Roman"/>
+                <w:b w:val="0"/>
+                <w:i w:val="0"/>
+                <w:color w:val="1A1A2E"/>
+                <w:sz w:val="22"/>
+              </w:rPr>
+              <w:t>20</w:t>
+            </w:r>
+          </w:p>
+        </w:tc>
+        <w:tc>
+          <w:tcPr>
+            <w:tcW w:type="dxa" w:w="1871"/>
+          </w:tcPr>
+          <w:p>
+            <w:pPr>
+              <w:jc w:val="left"/>
+            </w:pPr>
+            <w:r>
+              <w:rPr>
+                <w:rFonts w:ascii="Times New Roman" w:hAnsi="Times New Roman" w:eastAsia="Times New Roman"/>
+                <w:b w:val="0"/>
+                <w:i w:val="0"/>
+                <w:color w:val="1A1A2E"/>
+                <w:sz w:val="22"/>
+              </w:rPr>
+              <w:t>18</w:t>
+            </w:r>
+          </w:p>
+        </w:tc>
+        <w:tc>
+          <w:tcPr>
+            <w:tcW w:type="dxa" w:w="1871"/>
+          </w:tcPr>
+          <w:p>
+            <w:pPr>
+              <w:jc w:val="left"/>
+            </w:pPr>
+            <w:r>
+              <w:rPr>
+                <w:rFonts w:ascii="Times New Roman" w:hAnsi="Times New Roman" w:eastAsia="Times New Roman"/>
+                <w:b w:val="0"/>
+                <w:i w:val="0"/>
+                <w:color w:val="1A1A2E"/>
+                <w:sz w:val="22"/>
+              </w:rPr>
+              <w:t>не соответствует</w:t>
+            </w:r>
+          </w:p>
+        </w:tc>
+      </w:tr>
+      <w:tr>
+        <w:tc>
+          <w:tcPr>
+            <w:tcW w:type="dxa" w:w="1871"/>
+          </w:tcPr>
+          <w:p>
+            <w:pPr>
+              <w:jc w:val="left"/>
+            </w:pPr>
+            <w:r>
+              <w:rPr>
+                <w:rFonts w:ascii="Times New Roman" w:hAnsi="Times New Roman" w:eastAsia="Times New Roman"/>
+                <w:b w:val="0"/>
+                <w:i w:val="0"/>
+                <w:color w:val="1A1A2E"/>
+                <w:sz w:val="22"/>
+              </w:rPr>
+              <w:t>Покрытие пола</w:t>
+            </w:r>
+          </w:p>
+        </w:tc>
+        <w:tc>
+          <w:tcPr>
+            <w:tcW w:type="dxa" w:w="1871"/>
+          </w:tcPr>
+          <w:p>
+            <w:pPr>
+              <w:jc w:val="left"/>
+            </w:pPr>
+            <w:r>
+              <w:rPr>
+                <w:rFonts w:ascii="Times New Roman" w:hAnsi="Times New Roman" w:eastAsia="Times New Roman"/>
+                <w:b w:val="0"/>
+                <w:i w:val="0"/>
+                <w:color w:val="1A1A2E"/>
+                <w:sz w:val="22"/>
+              </w:rPr>
+              <w:t>-</w:t>
+            </w:r>
+          </w:p>
+        </w:tc>
+        <w:tc>
+          <w:tcPr>
+            <w:tcW w:type="dxa" w:w="1871"/>
+          </w:tcPr>
+          <w:p>
+            <w:pPr>
+              <w:jc w:val="left"/>
+            </w:pPr>
+            <w:r>
+              <w:rPr>
+                <w:rFonts w:ascii="Times New Roman" w:hAnsi="Times New Roman" w:eastAsia="Times New Roman"/>
+                <w:b w:val="0"/>
+                <w:i w:val="0"/>
+                <w:color w:val="1A1A2E"/>
+                <w:sz w:val="22"/>
+              </w:rPr>
+              <w:t>антистатическое</w:t>
+            </w:r>
+          </w:p>
+        </w:tc>
+        <w:tc>
+          <w:tcPr>
+            <w:tcW w:type="dxa" w:w="1871"/>
+          </w:tcPr>
+          <w:p>
+            <w:pPr>
+              <w:jc w:val="left"/>
+            </w:pPr>
+            <w:r>
+              <w:rPr>
+                <w:rFonts w:ascii="Times New Roman" w:hAnsi="Times New Roman" w:eastAsia="Times New Roman"/>
+                <w:b w:val="0"/>
+                <w:i w:val="0"/>
+                <w:color w:val="1A1A2E"/>
+                <w:sz w:val="22"/>
+              </w:rPr>
+              <w:t>антистатическое</w:t>
+            </w:r>
+          </w:p>
+        </w:tc>
+        <w:tc>
+          <w:tcPr>
+            <w:tcW w:type="dxa" w:w="1871"/>
+          </w:tcPr>
+          <w:p>
+            <w:pPr>
+              <w:jc w:val="left"/>
+            </w:pPr>
+            <w:r>
+              <w:rPr>
+                <w:rFonts w:ascii="Times New Roman" w:hAnsi="Times New Roman" w:eastAsia="Times New Roman"/>
+                <w:b w:val="0"/>
+                <w:i w:val="0"/>
+                <w:color w:val="1A1A2E"/>
+                <w:sz w:val="22"/>
+              </w:rPr>
+              <w:t>соответствует</w:t>
+            </w:r>
+          </w:p>
+        </w:tc>
+      </w:tr>
+      <w:tr>
+        <w:tc>
+          <w:tcPr>
+            <w:tcW w:type="dxa" w:w="1871"/>
+          </w:tcPr>
+          <w:p>
+            <w:pPr>
+              <w:jc w:val="left"/>
+            </w:pPr>
+            <w:r>
+              <w:rPr>
+                <w:rFonts w:ascii="Times New Roman" w:hAnsi="Times New Roman" w:eastAsia="Times New Roman"/>
+                <w:b w:val="0"/>
+                <w:i w:val="0"/>
+                <w:color w:val="1A1A2E"/>
+                <w:sz w:val="22"/>
+              </w:rPr>
+              <w:t>Отопление</w:t>
+            </w:r>
+          </w:p>
+        </w:tc>
+        <w:tc>
+          <w:tcPr>
+            <w:tcW w:type="dxa" w:w="1871"/>
+          </w:tcPr>
+          <w:p>
+            <w:pPr>
+              <w:jc w:val="left"/>
+            </w:pPr>
+            <w:r>
+              <w:rPr>
+                <w:rFonts w:ascii="Times New Roman" w:hAnsi="Times New Roman" w:eastAsia="Times New Roman"/>
+                <w:b w:val="0"/>
+                <w:i w:val="0"/>
+                <w:color w:val="1A1A2E"/>
+                <w:sz w:val="22"/>
+              </w:rPr>
+              <w:t>-</w:t>
+            </w:r>
+          </w:p>
+        </w:tc>
+        <w:tc>
+          <w:tcPr>
+            <w:tcW w:type="dxa" w:w="1871"/>
+          </w:tcPr>
+          <w:p>
+            <w:pPr>
+              <w:jc w:val="left"/>
+            </w:pPr>
+            <w:r>
+              <w:rPr>
+                <w:rFonts w:ascii="Times New Roman" w:hAnsi="Times New Roman" w:eastAsia="Times New Roman"/>
+                <w:b w:val="0"/>
+                <w:i w:val="0"/>
+                <w:color w:val="1A1A2E"/>
+                <w:sz w:val="22"/>
+              </w:rPr>
+              <w:t>должно быть</w:t>
+            </w:r>
+          </w:p>
+        </w:tc>
+        <w:tc>
+          <w:tcPr>
+            <w:tcW w:type="dxa" w:w="1871"/>
+          </w:tcPr>
+          <w:p>
+            <w:pPr>
+              <w:jc w:val="left"/>
+            </w:pPr>
+            <w:r>
+              <w:rPr>
+                <w:rFonts w:ascii="Times New Roman" w:hAnsi="Times New Roman" w:eastAsia="Times New Roman"/>
+                <w:b w:val="0"/>
+                <w:i w:val="0"/>
+                <w:color w:val="1A1A2E"/>
+                <w:sz w:val="22"/>
+              </w:rPr>
+              <w:t>есть</w:t>
+            </w:r>
+          </w:p>
+        </w:tc>
+        <w:tc>
+          <w:tcPr>
+            <w:tcW w:type="dxa" w:w="1871"/>
+          </w:tcPr>
+          <w:p>
+            <w:pPr>
+              <w:jc w:val="left"/>
+            </w:pPr>
+            <w:r>
+              <w:rPr>
+                <w:rFonts w:ascii="Times New Roman" w:hAnsi="Times New Roman" w:eastAsia="Times New Roman"/>
+                <w:b w:val="0"/>
+                <w:i w:val="0"/>
+                <w:color w:val="1A1A2E"/>
+                <w:sz w:val="22"/>
+              </w:rPr>
+              <w:t>соответствует</w:t>
+            </w:r>
+          </w:p>
+        </w:tc>
+      </w:tr>
+      <w:tr>
+        <w:tc>
+          <w:tcPr>
+            <w:tcW w:type="dxa" w:w="1871"/>
+          </w:tcPr>
+          <w:p>
+            <w:pPr>
+              <w:jc w:val="left"/>
+            </w:pPr>
+            <w:r>
+              <w:rPr>
+                <w:rFonts w:ascii="Times New Roman" w:hAnsi="Times New Roman" w:eastAsia="Times New Roman"/>
+                <w:b w:val="0"/>
+                <w:i w:val="0"/>
+                <w:color w:val="1A1A2E"/>
+                <w:sz w:val="22"/>
+              </w:rPr>
+              <w:t>Вентиляция искусственная</w:t>
+            </w:r>
+          </w:p>
+        </w:tc>
+        <w:tc>
+          <w:tcPr>
+            <w:tcW w:type="dxa" w:w="1871"/>
+          </w:tcPr>
+          <w:p>
+            <w:pPr>
+              <w:jc w:val="left"/>
+            </w:pPr>
+            <w:r>
+              <w:rPr>
+                <w:rFonts w:ascii="Times New Roman" w:hAnsi="Times New Roman" w:eastAsia="Times New Roman"/>
+                <w:b w:val="0"/>
+                <w:i w:val="0"/>
+                <w:color w:val="1A1A2E"/>
+                <w:sz w:val="22"/>
+              </w:rPr>
+              <w:t>-</w:t>
+            </w:r>
+          </w:p>
+        </w:tc>
+        <w:tc>
+          <w:tcPr>
+            <w:tcW w:type="dxa" w:w="1871"/>
+          </w:tcPr>
+          <w:p>
+            <w:pPr>
+              <w:jc w:val="left"/>
+            </w:pPr>
+            <w:r>
+              <w:rPr>
+                <w:rFonts w:ascii="Times New Roman" w:hAnsi="Times New Roman" w:eastAsia="Times New Roman"/>
+                <w:b w:val="0"/>
+                <w:i w:val="0"/>
+                <w:color w:val="1A1A2E"/>
+                <w:sz w:val="22"/>
+              </w:rPr>
+              <w:t>должна быть</w:t>
+            </w:r>
+          </w:p>
+        </w:tc>
+        <w:tc>
+          <w:tcPr>
+            <w:tcW w:type="dxa" w:w="1871"/>
+          </w:tcPr>
+          <w:p>
+            <w:pPr>
+              <w:jc w:val="left"/>
+            </w:pPr>
+            <w:r>
+              <w:rPr>
+                <w:rFonts w:ascii="Times New Roman" w:hAnsi="Times New Roman" w:eastAsia="Times New Roman"/>
+                <w:b w:val="0"/>
+                <w:i w:val="0"/>
+                <w:color w:val="1A1A2E"/>
+                <w:sz w:val="22"/>
+              </w:rPr>
+              <w:t>есть</w:t>
+            </w:r>
+          </w:p>
+        </w:tc>
+        <w:tc>
+          <w:tcPr>
+            <w:tcW w:type="dxa" w:w="1871"/>
+          </w:tcPr>
+          <w:p>
+            <w:pPr>
+              <w:jc w:val="left"/>
+            </w:pPr>
+            <w:r>
+              <w:rPr>
+                <w:rFonts w:ascii="Times New Roman" w:hAnsi="Times New Roman" w:eastAsia="Times New Roman"/>
+                <w:b w:val="0"/>
+                <w:i w:val="0"/>
+                <w:color w:val="1A1A2E"/>
+                <w:sz w:val="22"/>
+              </w:rPr>
+              <w:t>соответствует</w:t>
+            </w:r>
+          </w:p>
+        </w:tc>
+      </w:tr>
+      <w:tr>
+        <w:tc>
+          <w:tcPr>
+            <w:tcW w:type="dxa" w:w="1871"/>
+          </w:tcPr>
+          <w:p>
+            <w:pPr>
+              <w:jc w:val="left"/>
+            </w:pPr>
+            <w:r>
+              <w:rPr>
+                <w:rFonts w:ascii="Times New Roman" w:hAnsi="Times New Roman" w:eastAsia="Times New Roman"/>
+                <w:b w:val="0"/>
+                <w:i w:val="0"/>
+                <w:color w:val="1A1A2E"/>
+                <w:sz w:val="22"/>
+              </w:rPr>
+              <w:t>Температура воздуха</w:t>
+            </w:r>
+          </w:p>
+        </w:tc>
+        <w:tc>
+          <w:tcPr>
+            <w:tcW w:type="dxa" w:w="1871"/>
+          </w:tcPr>
+          <w:p>
+            <w:pPr>
+              <w:jc w:val="left"/>
+            </w:pPr>
+            <w:r>
+              <w:rPr>
+                <w:rFonts w:ascii="Times New Roman" w:hAnsi="Times New Roman" w:eastAsia="Times New Roman"/>
+                <w:b w:val="0"/>
+                <w:i w:val="0"/>
+                <w:color w:val="1A1A2E"/>
+                <w:sz w:val="22"/>
+              </w:rPr>
+              <w:t>°С</w:t>
+            </w:r>
+          </w:p>
+        </w:tc>
+        <w:tc>
+          <w:tcPr>
+            <w:tcW w:type="dxa" w:w="1871"/>
+          </w:tcPr>
+          <w:p>
+            <w:pPr>
+              <w:jc w:val="left"/>
+            </w:pPr>
+            <w:r>
+              <w:rPr>
+                <w:rFonts w:ascii="Times New Roman" w:hAnsi="Times New Roman" w:eastAsia="Times New Roman"/>
+                <w:b w:val="0"/>
+                <w:i w:val="0"/>
+                <w:color w:val="1A1A2E"/>
+                <w:sz w:val="22"/>
+              </w:rPr>
+              <w:t>18-22</w:t>
+            </w:r>
+          </w:p>
+        </w:tc>
+        <w:tc>
+          <w:tcPr>
+            <w:tcW w:type="dxa" w:w="1871"/>
           </w:tcPr>
           <w:p>
             <w:pPr>
@@ -1689,7 +3864,7 @@
         </w:tc>
         <w:tc>
           <w:tcPr>
-            <w:tcW w:type="dxa" w:w="2339"/>
+            <w:tcW w:type="dxa" w:w="1871"/>
           </w:tcPr>
           <w:p>
             <w:pPr>
@@ -1703,7 +3878,7 @@
                 <w:color w:val="1A1A2E"/>
                 <w:sz w:val="22"/>
               </w:rPr>
-              <w:t>Соответствует</w:t>
+              <w:t>соответствует</w:t>
             </w:r>
           </w:p>
         </w:tc>
@@ -1711,7 +3886,7 @@
       <w:tr>
         <w:tc>
           <w:tcPr>
-            <w:tcW w:type="dxa" w:w="2339"/>
+            <w:tcW w:type="dxa" w:w="1871"/>
           </w:tcPr>
           <w:p>
             <w:pPr>
@@ -1725,13 +3900,13 @@
                 <w:color w:val="1A1A2E"/>
                 <w:sz w:val="22"/>
               </w:rPr>
-              <w:t>Относительная влажность, %</w:t>
+              <w:t>Относ. влажность воздуха</w:t>
             </w:r>
           </w:p>
         </w:tc>
         <w:tc>
           <w:tcPr>
-            <w:tcW w:type="dxa" w:w="2339"/>
+            <w:tcW w:type="dxa" w:w="1871"/>
           </w:tcPr>
           <w:p>
             <w:pPr>
@@ -1745,13 +3920,33 @@
                 <w:color w:val="1A1A2E"/>
                 <w:sz w:val="22"/>
               </w:rPr>
-              <w:t>40-60</w:t>
+              <w:t>%</w:t>
             </w:r>
           </w:p>
         </w:tc>
         <w:tc>
           <w:tcPr>
-            <w:tcW w:type="dxa" w:w="2339"/>
+            <w:tcW w:type="dxa" w:w="1871"/>
+          </w:tcPr>
+          <w:p>
+            <w:pPr>
+              <w:jc w:val="left"/>
+            </w:pPr>
+            <w:r>
+              <w:rPr>
+                <w:rFonts w:ascii="Times New Roman" w:hAnsi="Times New Roman" w:eastAsia="Times New Roman"/>
+                <w:b w:val="0"/>
+                <w:i w:val="0"/>
+                <w:color w:val="1A1A2E"/>
+                <w:sz w:val="22"/>
+              </w:rPr>
+              <w:t>31-62</w:t>
+            </w:r>
+          </w:p>
+        </w:tc>
+        <w:tc>
+          <w:tcPr>
+            <w:tcW w:type="dxa" w:w="1871"/>
           </w:tcPr>
           <w:p>
             <w:pPr>
@@ -1771,7 +3966,7 @@
         </w:tc>
         <w:tc>
           <w:tcPr>
-            <w:tcW w:type="dxa" w:w="2339"/>
+            <w:tcW w:type="dxa" w:w="1871"/>
           </w:tcPr>
           <w:p>
             <w:pPr>
@@ -1785,7 +3980,7 @@
                 <w:color w:val="1A1A2E"/>
                 <w:sz w:val="22"/>
               </w:rPr>
-              <w:t>Соответствует</w:t>
+              <w:t>соответствует</w:t>
             </w:r>
           </w:p>
         </w:tc>
@@ -1793,7 +3988,7 @@
       <w:tr>
         <w:tc>
           <w:tcPr>
-            <w:tcW w:type="dxa" w:w="2339"/>
+            <w:tcW w:type="dxa" w:w="1871"/>
           </w:tcPr>
           <w:p>
             <w:pPr>
@@ -1807,13 +4002,33 @@
                 <w:color w:val="1A1A2E"/>
                 <w:sz w:val="22"/>
               </w:rPr>
-              <w:t>Скорость движения воздуха, м/с</w:t>
+              <w:t>Подвижность воздуха</w:t>
             </w:r>
           </w:p>
         </w:tc>
         <w:tc>
           <w:tcPr>
-            <w:tcW w:type="dxa" w:w="2339"/>
+            <w:tcW w:type="dxa" w:w="1871"/>
+          </w:tcPr>
+          <w:p>
+            <w:pPr>
+              <w:jc w:val="left"/>
+            </w:pPr>
+            <w:r>
+              <w:rPr>
+                <w:rFonts w:ascii="Times New Roman" w:hAnsi="Times New Roman" w:eastAsia="Times New Roman"/>
+                <w:b w:val="0"/>
+                <w:i w:val="0"/>
+                <w:color w:val="1A1A2E"/>
+                <w:sz w:val="22"/>
+              </w:rPr>
+              <w:t>м/с</w:t>
+            </w:r>
+          </w:p>
+        </w:tc>
+        <w:tc>
+          <w:tcPr>
+            <w:tcW w:type="dxa" w:w="1871"/>
           </w:tcPr>
           <w:p>
             <w:pPr>
@@ -1833,7 +4048,7 @@
         </w:tc>
         <w:tc>
           <w:tcPr>
-            <w:tcW w:type="dxa" w:w="2339"/>
+            <w:tcW w:type="dxa" w:w="1871"/>
           </w:tcPr>
           <w:p>
             <w:pPr>
@@ -1853,7 +4068,7 @@
         </w:tc>
         <w:tc>
           <w:tcPr>
-            <w:tcW w:type="dxa" w:w="2339"/>
+            <w:tcW w:type="dxa" w:w="1871"/>
           </w:tcPr>
           <w:p>
             <w:pPr>
@@ -1867,7 +4082,7 @@
                 <w:color w:val="1A1A2E"/>
                 <w:sz w:val="22"/>
               </w:rPr>
-              <w:t>Соответствует</w:t>
+              <w:t>соответствует</w:t>
             </w:r>
           </w:p>
         </w:tc>
@@ -1875,7 +4090,7 @@
       <w:tr>
         <w:tc>
           <w:tcPr>
-            <w:tcW w:type="dxa" w:w="2339"/>
+            <w:tcW w:type="dxa" w:w="1871"/>
           </w:tcPr>
           <w:p>
             <w:pPr>
@@ -1889,13 +4104,13 @@
                 <w:color w:val="1A1A2E"/>
                 <w:sz w:val="22"/>
               </w:rPr>
-              <w:t>Уровень шума, дБА</w:t>
+              <w:t>Уровень шума</w:t>
             </w:r>
           </w:p>
         </w:tc>
         <w:tc>
           <w:tcPr>
-            <w:tcW w:type="dxa" w:w="2339"/>
+            <w:tcW w:type="dxa" w:w="1871"/>
           </w:tcPr>
           <w:p>
             <w:pPr>
@@ -1909,13 +4124,13 @@
                 <w:color w:val="1A1A2E"/>
                 <w:sz w:val="22"/>
               </w:rPr>
-              <w:t>не более 50</w:t>
+              <w:t>дБА</w:t>
             </w:r>
           </w:p>
         </w:tc>
         <w:tc>
           <w:tcPr>
-            <w:tcW w:type="dxa" w:w="2339"/>
+            <w:tcW w:type="dxa" w:w="1871"/>
           </w:tcPr>
           <w:p>
             <w:pPr>
@@ -1929,13 +4144,13 @@
                 <w:color w:val="1A1A2E"/>
                 <w:sz w:val="22"/>
               </w:rPr>
-              <w:t>46</w:t>
+              <w:t>50</w:t>
             </w:r>
           </w:p>
         </w:tc>
         <w:tc>
           <w:tcPr>
-            <w:tcW w:type="dxa" w:w="2339"/>
+            <w:tcW w:type="dxa" w:w="1871"/>
           </w:tcPr>
           <w:p>
             <w:pPr>
@@ -1949,15 +4164,13 @@
                 <w:color w:val="1A1A2E"/>
                 <w:sz w:val="22"/>
               </w:rPr>
-              <w:t>Соответствует</w:t>
+              <w:t>48</w:t>
             </w:r>
           </w:p>
         </w:tc>
-      </w:tr>
-      <w:tr>
         <w:tc>
           <w:tcPr>
-            <w:tcW w:type="dxa" w:w="2339"/>
+            <w:tcW w:type="dxa" w:w="1871"/>
           </w:tcPr>
           <w:p>
             <w:pPr>
@@ -1971,13 +4184,15 @@
                 <w:color w:val="1A1A2E"/>
                 <w:sz w:val="22"/>
               </w:rPr>
-              <w:t>Освещенность, лк</w:t>
+              <w:t>соответствует</w:t>
             </w:r>
           </w:p>
         </w:tc>
+      </w:tr>
+      <w:tr>
         <w:tc>
           <w:tcPr>
-            <w:tcW w:type="dxa" w:w="2339"/>
+            <w:tcW w:type="dxa" w:w="1871"/>
           </w:tcPr>
           <w:p>
             <w:pPr>
@@ -1991,13 +4206,13 @@
                 <w:color w:val="1A1A2E"/>
                 <w:sz w:val="22"/>
               </w:rPr>
-              <w:t>300-500</w:t>
+              <w:t>Расстояние от глаз до экрана</w:t>
             </w:r>
           </w:p>
         </w:tc>
         <w:tc>
           <w:tcPr>
-            <w:tcW w:type="dxa" w:w="2339"/>
+            <w:tcW w:type="dxa" w:w="1871"/>
           </w:tcPr>
           <w:p>
             <w:pPr>
@@ -2011,13 +4226,13 @@
                 <w:color w:val="1A1A2E"/>
                 <w:sz w:val="22"/>
               </w:rPr>
-              <w:t>300</w:t>
+              <w:t>мм</w:t>
             </w:r>
           </w:p>
         </w:tc>
         <w:tc>
           <w:tcPr>
-            <w:tcW w:type="dxa" w:w="2339"/>
+            <w:tcW w:type="dxa" w:w="1871"/>
           </w:tcPr>
           <w:p>
             <w:pPr>
@@ -2031,15 +4246,13 @@
                 <w:color w:val="1A1A2E"/>
                 <w:sz w:val="22"/>
               </w:rPr>
-              <w:t>Соответствует</w:t>
+              <w:t>500-700</w:t>
             </w:r>
           </w:p>
         </w:tc>
-      </w:tr>
-      <w:tr>
         <w:tc>
           <w:tcPr>
-            <w:tcW w:type="dxa" w:w="2339"/>
+            <w:tcW w:type="dxa" w:w="1871"/>
           </w:tcPr>
           <w:p>
             <w:pPr>
@@ -2053,13 +4266,13 @@
                 <w:color w:val="1A1A2E"/>
                 <w:sz w:val="22"/>
               </w:rPr>
-              <w:t>Площадь на 1 рабочее место, м²</w:t>
+              <w:t>600</w:t>
             </w:r>
           </w:p>
         </w:tc>
         <w:tc>
           <w:tcPr>
-            <w:tcW w:type="dxa" w:w="2339"/>
+            <w:tcW w:type="dxa" w:w="1871"/>
           </w:tcPr>
           <w:p>
             <w:pPr>
@@ -2073,13 +4286,15 @@
                 <w:color w:val="1A1A2E"/>
                 <w:sz w:val="22"/>
               </w:rPr>
-              <w:t>не менее 6</w:t>
+              <w:t>соответствует</w:t>
             </w:r>
           </w:p>
         </w:tc>
+      </w:tr>
+      <w:tr>
         <w:tc>
           <w:tcPr>
-            <w:tcW w:type="dxa" w:w="2339"/>
+            <w:tcW w:type="dxa" w:w="1871"/>
           </w:tcPr>
           <w:p>
             <w:pPr>
@@ -2093,13 +4308,13 @@
                 <w:color w:val="1A1A2E"/>
                 <w:sz w:val="22"/>
               </w:rPr>
-              <w:t>6</w:t>
+              <w:t>Наличие регулирующих устройств на окнах</w:t>
             </w:r>
           </w:p>
         </w:tc>
         <w:tc>
           <w:tcPr>
-            <w:tcW w:type="dxa" w:w="2339"/>
+            <w:tcW w:type="dxa" w:w="1871"/>
           </w:tcPr>
           <w:p>
             <w:pPr>
@@ -2113,15 +4328,13 @@
                 <w:color w:val="1A1A2E"/>
                 <w:sz w:val="22"/>
               </w:rPr>
-              <w:t>Соответствует</w:t>
+              <w:t>-</w:t>
             </w:r>
           </w:p>
         </w:tc>
-      </w:tr>
-      <w:tr>
         <w:tc>
           <w:tcPr>
-            <w:tcW w:type="dxa" w:w="2339"/>
+            <w:tcW w:type="dxa" w:w="1871"/>
           </w:tcPr>
           <w:p>
             <w:pPr>
@@ -2135,13 +4348,13 @@
                 <w:color w:val="1A1A2E"/>
                 <w:sz w:val="22"/>
               </w:rPr>
-              <w:t>Объем на 1 человека, м³</w:t>
+              <w:t>должно быть</w:t>
             </w:r>
           </w:p>
         </w:tc>
         <w:tc>
           <w:tcPr>
-            <w:tcW w:type="dxa" w:w="2339"/>
+            <w:tcW w:type="dxa" w:w="1871"/>
           </w:tcPr>
           <w:p>
             <w:pPr>
@@ -2155,13 +4368,13 @@
                 <w:color w:val="1A1A2E"/>
                 <w:sz w:val="22"/>
               </w:rPr>
-              <w:t>не менее 20</w:t>
+              <w:t>есть (жалюзи)</w:t>
             </w:r>
           </w:p>
         </w:tc>
         <w:tc>
           <w:tcPr>
-            <w:tcW w:type="dxa" w:w="2339"/>
+            <w:tcW w:type="dxa" w:w="1871"/>
           </w:tcPr>
           <w:p>
             <w:pPr>
@@ -2175,13 +4388,15 @@
                 <w:color w:val="1A1A2E"/>
                 <w:sz w:val="22"/>
               </w:rPr>
-              <w:t>18</w:t>
+              <w:t>соответствует</w:t>
             </w:r>
           </w:p>
         </w:tc>
+      </w:tr>
+      <w:tr>
         <w:tc>
           <w:tcPr>
-            <w:tcW w:type="dxa" w:w="2339"/>
+            <w:tcW w:type="dxa" w:w="1871"/>
           </w:tcPr>
           <w:p>
             <w:pPr>
@@ -2195,7 +4410,801 @@
                 <w:color w:val="1A1A2E"/>
                 <w:sz w:val="22"/>
               </w:rPr>
-              <w:t>Отклонение 10%</w:t>
+              <w:t>Влажная уборка</w:t>
+            </w:r>
+          </w:p>
+        </w:tc>
+        <w:tc>
+          <w:tcPr>
+            <w:tcW w:type="dxa" w:w="1871"/>
+          </w:tcPr>
+          <w:p>
+            <w:pPr>
+              <w:jc w:val="left"/>
+            </w:pPr>
+            <w:r>
+              <w:rPr>
+                <w:rFonts w:ascii="Times New Roman" w:hAnsi="Times New Roman" w:eastAsia="Times New Roman"/>
+                <w:b w:val="0"/>
+                <w:i w:val="0"/>
+                <w:color w:val="1A1A2E"/>
+                <w:sz w:val="22"/>
+              </w:rPr>
+              <w:t>раз/день</w:t>
+            </w:r>
+          </w:p>
+        </w:tc>
+        <w:tc>
+          <w:tcPr>
+            <w:tcW w:type="dxa" w:w="1871"/>
+          </w:tcPr>
+          <w:p>
+            <w:pPr>
+              <w:jc w:val="left"/>
+            </w:pPr>
+            <w:r>
+              <w:rPr>
+                <w:rFonts w:ascii="Times New Roman" w:hAnsi="Times New Roman" w:eastAsia="Times New Roman"/>
+                <w:b w:val="0"/>
+                <w:i w:val="0"/>
+                <w:color w:val="1A1A2E"/>
+                <w:sz w:val="22"/>
+              </w:rPr>
+              <w:t>1</w:t>
+            </w:r>
+          </w:p>
+        </w:tc>
+        <w:tc>
+          <w:tcPr>
+            <w:tcW w:type="dxa" w:w="1871"/>
+          </w:tcPr>
+          <w:p>
+            <w:pPr>
+              <w:jc w:val="left"/>
+            </w:pPr>
+            <w:r>
+              <w:rPr>
+                <w:rFonts w:ascii="Times New Roman" w:hAnsi="Times New Roman" w:eastAsia="Times New Roman"/>
+                <w:b w:val="0"/>
+                <w:i w:val="0"/>
+                <w:color w:val="1A1A2E"/>
+                <w:sz w:val="22"/>
+              </w:rPr>
+              <w:t>1</w:t>
+            </w:r>
+          </w:p>
+        </w:tc>
+        <w:tc>
+          <w:tcPr>
+            <w:tcW w:type="dxa" w:w="1871"/>
+          </w:tcPr>
+          <w:p>
+            <w:pPr>
+              <w:jc w:val="left"/>
+            </w:pPr>
+            <w:r>
+              <w:rPr>
+                <w:rFonts w:ascii="Times New Roman" w:hAnsi="Times New Roman" w:eastAsia="Times New Roman"/>
+                <w:b w:val="0"/>
+                <w:i w:val="0"/>
+                <w:color w:val="1A1A2E"/>
+                <w:sz w:val="22"/>
+              </w:rPr>
+              <w:t>соответствует</w:t>
+            </w:r>
+          </w:p>
+        </w:tc>
+      </w:tr>
+      <w:tr>
+        <w:tc>
+          <w:tcPr>
+            <w:tcW w:type="dxa" w:w="1871"/>
+          </w:tcPr>
+          <w:p>
+            <w:pPr>
+              <w:jc w:val="left"/>
+            </w:pPr>
+            <w:r>
+              <w:rPr>
+                <w:rFonts w:ascii="Times New Roman" w:hAnsi="Times New Roman" w:eastAsia="Times New Roman"/>
+                <w:b w:val="0"/>
+                <w:i w:val="0"/>
+                <w:color w:val="1A1A2E"/>
+                <w:sz w:val="22"/>
+              </w:rPr>
+              <w:t>Чистка светильников</w:t>
+            </w:r>
+          </w:p>
+        </w:tc>
+        <w:tc>
+          <w:tcPr>
+            <w:tcW w:type="dxa" w:w="1871"/>
+          </w:tcPr>
+          <w:p>
+            <w:pPr>
+              <w:jc w:val="left"/>
+            </w:pPr>
+            <w:r>
+              <w:rPr>
+                <w:rFonts w:ascii="Times New Roman" w:hAnsi="Times New Roman" w:eastAsia="Times New Roman"/>
+                <w:b w:val="0"/>
+                <w:i w:val="0"/>
+                <w:color w:val="1A1A2E"/>
+                <w:sz w:val="22"/>
+              </w:rPr>
+              <w:t>раз/год</w:t>
+            </w:r>
+          </w:p>
+        </w:tc>
+        <w:tc>
+          <w:tcPr>
+            <w:tcW w:type="dxa" w:w="1871"/>
+          </w:tcPr>
+          <w:p>
+            <w:pPr>
+              <w:jc w:val="left"/>
+            </w:pPr>
+            <w:r>
+              <w:rPr>
+                <w:rFonts w:ascii="Times New Roman" w:hAnsi="Times New Roman" w:eastAsia="Times New Roman"/>
+                <w:b w:val="0"/>
+                <w:i w:val="0"/>
+                <w:color w:val="1A1A2E"/>
+                <w:sz w:val="22"/>
+              </w:rPr>
+              <w:t>2</w:t>
+            </w:r>
+          </w:p>
+        </w:tc>
+        <w:tc>
+          <w:tcPr>
+            <w:tcW w:type="dxa" w:w="1871"/>
+          </w:tcPr>
+          <w:p>
+            <w:pPr>
+              <w:jc w:val="left"/>
+            </w:pPr>
+            <w:r>
+              <w:rPr>
+                <w:rFonts w:ascii="Times New Roman" w:hAnsi="Times New Roman" w:eastAsia="Times New Roman"/>
+                <w:b w:val="0"/>
+                <w:i w:val="0"/>
+                <w:color w:val="1A1A2E"/>
+                <w:sz w:val="22"/>
+              </w:rPr>
+              <w:t>2</w:t>
+            </w:r>
+          </w:p>
+        </w:tc>
+        <w:tc>
+          <w:tcPr>
+            <w:tcW w:type="dxa" w:w="1871"/>
+          </w:tcPr>
+          <w:p>
+            <w:pPr>
+              <w:jc w:val="left"/>
+            </w:pPr>
+            <w:r>
+              <w:rPr>
+                <w:rFonts w:ascii="Times New Roman" w:hAnsi="Times New Roman" w:eastAsia="Times New Roman"/>
+                <w:b w:val="0"/>
+                <w:i w:val="0"/>
+                <w:color w:val="1A1A2E"/>
+                <w:sz w:val="22"/>
+              </w:rPr>
+              <w:t>соответствует</w:t>
+            </w:r>
+          </w:p>
+        </w:tc>
+      </w:tr>
+      <w:tr>
+        <w:tc>
+          <w:tcPr>
+            <w:tcW w:type="dxa" w:w="1871"/>
+          </w:tcPr>
+          <w:p>
+            <w:pPr>
+              <w:jc w:val="left"/>
+            </w:pPr>
+            <w:r>
+              <w:rPr>
+                <w:rFonts w:ascii="Times New Roman" w:hAnsi="Times New Roman" w:eastAsia="Times New Roman"/>
+                <w:b w:val="0"/>
+                <w:i w:val="0"/>
+                <w:color w:val="1A1A2E"/>
+                <w:sz w:val="22"/>
+              </w:rPr>
+              <w:t>Наличие огнетушителя</w:t>
+            </w:r>
+          </w:p>
+        </w:tc>
+        <w:tc>
+          <w:tcPr>
+            <w:tcW w:type="dxa" w:w="1871"/>
+          </w:tcPr>
+          <w:p>
+            <w:pPr>
+              <w:jc w:val="left"/>
+            </w:pPr>
+            <w:r>
+              <w:rPr>
+                <w:rFonts w:ascii="Times New Roman" w:hAnsi="Times New Roman" w:eastAsia="Times New Roman"/>
+                <w:b w:val="0"/>
+                <w:i w:val="0"/>
+                <w:color w:val="1A1A2E"/>
+                <w:sz w:val="22"/>
+              </w:rPr>
+              <w:t>-</w:t>
+            </w:r>
+          </w:p>
+        </w:tc>
+        <w:tc>
+          <w:tcPr>
+            <w:tcW w:type="dxa" w:w="1871"/>
+          </w:tcPr>
+          <w:p>
+            <w:pPr>
+              <w:jc w:val="left"/>
+            </w:pPr>
+            <w:r>
+              <w:rPr>
+                <w:rFonts w:ascii="Times New Roman" w:hAnsi="Times New Roman" w:eastAsia="Times New Roman"/>
+                <w:b w:val="0"/>
+                <w:i w:val="0"/>
+                <w:color w:val="1A1A2E"/>
+                <w:sz w:val="22"/>
+              </w:rPr>
+              <w:t>должен быть</w:t>
+            </w:r>
+          </w:p>
+        </w:tc>
+        <w:tc>
+          <w:tcPr>
+            <w:tcW w:type="dxa" w:w="1871"/>
+          </w:tcPr>
+          <w:p>
+            <w:pPr>
+              <w:jc w:val="left"/>
+            </w:pPr>
+            <w:r>
+              <w:rPr>
+                <w:rFonts w:ascii="Times New Roman" w:hAnsi="Times New Roman" w:eastAsia="Times New Roman"/>
+                <w:b w:val="0"/>
+                <w:i w:val="0"/>
+                <w:color w:val="1A1A2E"/>
+                <w:sz w:val="22"/>
+              </w:rPr>
+              <w:t>есть</w:t>
+            </w:r>
+          </w:p>
+        </w:tc>
+        <w:tc>
+          <w:tcPr>
+            <w:tcW w:type="dxa" w:w="1871"/>
+          </w:tcPr>
+          <w:p>
+            <w:pPr>
+              <w:jc w:val="left"/>
+            </w:pPr>
+            <w:r>
+              <w:rPr>
+                <w:rFonts w:ascii="Times New Roman" w:hAnsi="Times New Roman" w:eastAsia="Times New Roman"/>
+                <w:b w:val="0"/>
+                <w:i w:val="0"/>
+                <w:color w:val="1A1A2E"/>
+                <w:sz w:val="22"/>
+              </w:rPr>
+              <w:t>соответствует</w:t>
+            </w:r>
+          </w:p>
+        </w:tc>
+      </w:tr>
+      <w:tr>
+        <w:tc>
+          <w:tcPr>
+            <w:tcW w:type="dxa" w:w="1871"/>
+          </w:tcPr>
+          <w:p>
+            <w:pPr>
+              <w:jc w:val="left"/>
+            </w:pPr>
+            <w:r>
+              <w:rPr>
+                <w:rFonts w:ascii="Times New Roman" w:hAnsi="Times New Roman" w:eastAsia="Times New Roman"/>
+                <w:b w:val="0"/>
+                <w:i w:val="0"/>
+                <w:color w:val="1A1A2E"/>
+                <w:sz w:val="22"/>
+              </w:rPr>
+              <w:t>Наличие аптечки</w:t>
+            </w:r>
+          </w:p>
+        </w:tc>
+        <w:tc>
+          <w:tcPr>
+            <w:tcW w:type="dxa" w:w="1871"/>
+          </w:tcPr>
+          <w:p>
+            <w:pPr>
+              <w:jc w:val="left"/>
+            </w:pPr>
+            <w:r>
+              <w:rPr>
+                <w:rFonts w:ascii="Times New Roman" w:hAnsi="Times New Roman" w:eastAsia="Times New Roman"/>
+                <w:b w:val="0"/>
+                <w:i w:val="0"/>
+                <w:color w:val="1A1A2E"/>
+                <w:sz w:val="22"/>
+              </w:rPr>
+              <w:t>-</w:t>
+            </w:r>
+          </w:p>
+        </w:tc>
+        <w:tc>
+          <w:tcPr>
+            <w:tcW w:type="dxa" w:w="1871"/>
+          </w:tcPr>
+          <w:p>
+            <w:pPr>
+              <w:jc w:val="left"/>
+            </w:pPr>
+            <w:r>
+              <w:rPr>
+                <w:rFonts w:ascii="Times New Roman" w:hAnsi="Times New Roman" w:eastAsia="Times New Roman"/>
+                <w:b w:val="0"/>
+                <w:i w:val="0"/>
+                <w:color w:val="1A1A2E"/>
+                <w:sz w:val="22"/>
+              </w:rPr>
+              <w:t>должна быть</w:t>
+            </w:r>
+          </w:p>
+        </w:tc>
+        <w:tc>
+          <w:tcPr>
+            <w:tcW w:type="dxa" w:w="1871"/>
+          </w:tcPr>
+          <w:p>
+            <w:pPr>
+              <w:jc w:val="left"/>
+            </w:pPr>
+            <w:r>
+              <w:rPr>
+                <w:rFonts w:ascii="Times New Roman" w:hAnsi="Times New Roman" w:eastAsia="Times New Roman"/>
+                <w:b w:val="0"/>
+                <w:i w:val="0"/>
+                <w:color w:val="1A1A2E"/>
+                <w:sz w:val="22"/>
+              </w:rPr>
+              <w:t>есть</w:t>
+            </w:r>
+          </w:p>
+        </w:tc>
+        <w:tc>
+          <w:tcPr>
+            <w:tcW w:type="dxa" w:w="1871"/>
+          </w:tcPr>
+          <w:p>
+            <w:pPr>
+              <w:jc w:val="left"/>
+            </w:pPr>
+            <w:r>
+              <w:rPr>
+                <w:rFonts w:ascii="Times New Roman" w:hAnsi="Times New Roman" w:eastAsia="Times New Roman"/>
+                <w:b w:val="0"/>
+                <w:i w:val="0"/>
+                <w:color w:val="1A1A2E"/>
+                <w:sz w:val="22"/>
+              </w:rPr>
+              <w:t>соответствует</w:t>
+            </w:r>
+          </w:p>
+        </w:tc>
+      </w:tr>
+      <w:tr>
+        <w:tc>
+          <w:tcPr>
+            <w:tcW w:type="dxa" w:w="1871"/>
+          </w:tcPr>
+          <w:p>
+            <w:pPr>
+              <w:jc w:val="left"/>
+            </w:pPr>
+            <w:r>
+              <w:rPr>
+                <w:rFonts w:ascii="Times New Roman" w:hAnsi="Times New Roman" w:eastAsia="Times New Roman"/>
+                <w:b w:val="0"/>
+                <w:i w:val="0"/>
+                <w:color w:val="1A1A2E"/>
+                <w:sz w:val="22"/>
+              </w:rPr>
+              <w:t>Высота рабочего стола</w:t>
+            </w:r>
+          </w:p>
+        </w:tc>
+        <w:tc>
+          <w:tcPr>
+            <w:tcW w:type="dxa" w:w="1871"/>
+          </w:tcPr>
+          <w:p>
+            <w:pPr>
+              <w:jc w:val="left"/>
+            </w:pPr>
+            <w:r>
+              <w:rPr>
+                <w:rFonts w:ascii="Times New Roman" w:hAnsi="Times New Roman" w:eastAsia="Times New Roman"/>
+                <w:b w:val="0"/>
+                <w:i w:val="0"/>
+                <w:color w:val="1A1A2E"/>
+                <w:sz w:val="22"/>
+              </w:rPr>
+              <w:t>мм</w:t>
+            </w:r>
+          </w:p>
+        </w:tc>
+        <w:tc>
+          <w:tcPr>
+            <w:tcW w:type="dxa" w:w="1871"/>
+          </w:tcPr>
+          <w:p>
+            <w:pPr>
+              <w:jc w:val="left"/>
+            </w:pPr>
+            <w:r>
+              <w:rPr>
+                <w:rFonts w:ascii="Times New Roman" w:hAnsi="Times New Roman" w:eastAsia="Times New Roman"/>
+                <w:b w:val="0"/>
+                <w:i w:val="0"/>
+                <w:color w:val="1A1A2E"/>
+                <w:sz w:val="22"/>
+              </w:rPr>
+              <w:t>725</w:t>
+            </w:r>
+          </w:p>
+        </w:tc>
+        <w:tc>
+          <w:tcPr>
+            <w:tcW w:type="dxa" w:w="1871"/>
+          </w:tcPr>
+          <w:p>
+            <w:pPr>
+              <w:jc w:val="left"/>
+            </w:pPr>
+            <w:r>
+              <w:rPr>
+                <w:rFonts w:ascii="Times New Roman" w:hAnsi="Times New Roman" w:eastAsia="Times New Roman"/>
+                <w:b w:val="0"/>
+                <w:i w:val="0"/>
+                <w:color w:val="1A1A2E"/>
+                <w:sz w:val="22"/>
+              </w:rPr>
+              <w:t>725</w:t>
+            </w:r>
+          </w:p>
+        </w:tc>
+        <w:tc>
+          <w:tcPr>
+            <w:tcW w:type="dxa" w:w="1871"/>
+          </w:tcPr>
+          <w:p>
+            <w:pPr>
+              <w:jc w:val="left"/>
+            </w:pPr>
+            <w:r>
+              <w:rPr>
+                <w:rFonts w:ascii="Times New Roman" w:hAnsi="Times New Roman" w:eastAsia="Times New Roman"/>
+                <w:b w:val="0"/>
+                <w:i w:val="0"/>
+                <w:color w:val="1A1A2E"/>
+                <w:sz w:val="22"/>
+              </w:rPr>
+              <w:t>соответствует</w:t>
+            </w:r>
+          </w:p>
+        </w:tc>
+      </w:tr>
+      <w:tr>
+        <w:tc>
+          <w:tcPr>
+            <w:tcW w:type="dxa" w:w="1871"/>
+          </w:tcPr>
+          <w:p>
+            <w:pPr>
+              <w:jc w:val="left"/>
+            </w:pPr>
+            <w:r>
+              <w:rPr>
+                <w:rFonts w:ascii="Times New Roman" w:hAnsi="Times New Roman" w:eastAsia="Times New Roman"/>
+                <w:b w:val="0"/>
+                <w:i w:val="0"/>
+                <w:color w:val="1A1A2E"/>
+                <w:sz w:val="22"/>
+              </w:rPr>
+              <w:t>Пространство для ног</w:t>
+            </w:r>
+          </w:p>
+        </w:tc>
+        <w:tc>
+          <w:tcPr>
+            <w:tcW w:type="dxa" w:w="1871"/>
+          </w:tcPr>
+          <w:p>
+            <w:pPr>
+              <w:jc w:val="left"/>
+            </w:pPr>
+            <w:r>
+              <w:rPr>
+                <w:rFonts w:ascii="Times New Roman" w:hAnsi="Times New Roman" w:eastAsia="Times New Roman"/>
+                <w:b w:val="0"/>
+                <w:i w:val="0"/>
+                <w:color w:val="1A1A2E"/>
+                <w:sz w:val="22"/>
+              </w:rPr>
+              <w:t>мм</w:t>
+            </w:r>
+          </w:p>
+        </w:tc>
+        <w:tc>
+          <w:tcPr>
+            <w:tcW w:type="dxa" w:w="1871"/>
+          </w:tcPr>
+          <w:p>
+            <w:pPr>
+              <w:jc w:val="left"/>
+            </w:pPr>
+            <w:r>
+              <w:rPr>
+                <w:rFonts w:ascii="Times New Roman" w:hAnsi="Times New Roman" w:eastAsia="Times New Roman"/>
+                <w:b w:val="0"/>
+                <w:i w:val="0"/>
+                <w:color w:val="1A1A2E"/>
+                <w:sz w:val="22"/>
+              </w:rPr>
+              <w:t>600х500х450</w:t>
+            </w:r>
+          </w:p>
+        </w:tc>
+        <w:tc>
+          <w:tcPr>
+            <w:tcW w:type="dxa" w:w="1871"/>
+          </w:tcPr>
+          <w:p>
+            <w:pPr>
+              <w:jc w:val="left"/>
+            </w:pPr>
+            <w:r>
+              <w:rPr>
+                <w:rFonts w:ascii="Times New Roman" w:hAnsi="Times New Roman" w:eastAsia="Times New Roman"/>
+                <w:b w:val="0"/>
+                <w:i w:val="0"/>
+                <w:color w:val="1A1A2E"/>
+                <w:sz w:val="22"/>
+              </w:rPr>
+              <w:t>600х500х450</w:t>
+            </w:r>
+          </w:p>
+        </w:tc>
+        <w:tc>
+          <w:tcPr>
+            <w:tcW w:type="dxa" w:w="1871"/>
+          </w:tcPr>
+          <w:p>
+            <w:pPr>
+              <w:jc w:val="left"/>
+            </w:pPr>
+            <w:r>
+              <w:rPr>
+                <w:rFonts w:ascii="Times New Roman" w:hAnsi="Times New Roman" w:eastAsia="Times New Roman"/>
+                <w:b w:val="0"/>
+                <w:i w:val="0"/>
+                <w:color w:val="1A1A2E"/>
+                <w:sz w:val="22"/>
+              </w:rPr>
+              <w:t>соответствует</w:t>
+            </w:r>
+          </w:p>
+        </w:tc>
+      </w:tr>
+      <w:tr>
+        <w:tc>
+          <w:tcPr>
+            <w:tcW w:type="dxa" w:w="1871"/>
+          </w:tcPr>
+          <w:p>
+            <w:pPr>
+              <w:jc w:val="left"/>
+            </w:pPr>
+            <w:r>
+              <w:rPr>
+                <w:rFonts w:ascii="Times New Roman" w:hAnsi="Times New Roman" w:eastAsia="Times New Roman"/>
+                <w:b w:val="0"/>
+                <w:i w:val="0"/>
+                <w:color w:val="1A1A2E"/>
+                <w:sz w:val="22"/>
+              </w:rPr>
+              <w:t>Работа за ПК без перерыва</w:t>
+            </w:r>
+          </w:p>
+        </w:tc>
+        <w:tc>
+          <w:tcPr>
+            <w:tcW w:type="dxa" w:w="1871"/>
+          </w:tcPr>
+          <w:p>
+            <w:pPr>
+              <w:jc w:val="left"/>
+            </w:pPr>
+            <w:r>
+              <w:rPr>
+                <w:rFonts w:ascii="Times New Roman" w:hAnsi="Times New Roman" w:eastAsia="Times New Roman"/>
+                <w:b w:val="0"/>
+                <w:i w:val="0"/>
+                <w:color w:val="1A1A2E"/>
+                <w:sz w:val="22"/>
+              </w:rPr>
+              <w:t>час</w:t>
+            </w:r>
+          </w:p>
+        </w:tc>
+        <w:tc>
+          <w:tcPr>
+            <w:tcW w:type="dxa" w:w="1871"/>
+          </w:tcPr>
+          <w:p>
+            <w:pPr>
+              <w:jc w:val="left"/>
+            </w:pPr>
+            <w:r>
+              <w:rPr>
+                <w:rFonts w:ascii="Times New Roman" w:hAnsi="Times New Roman" w:eastAsia="Times New Roman"/>
+                <w:b w:val="0"/>
+                <w:i w:val="0"/>
+                <w:color w:val="1A1A2E"/>
+                <w:sz w:val="22"/>
+              </w:rPr>
+              <w:t>не более 2</w:t>
+            </w:r>
+          </w:p>
+        </w:tc>
+        <w:tc>
+          <w:tcPr>
+            <w:tcW w:type="dxa" w:w="1871"/>
+          </w:tcPr>
+          <w:p>
+            <w:pPr>
+              <w:jc w:val="left"/>
+            </w:pPr>
+            <w:r>
+              <w:rPr>
+                <w:rFonts w:ascii="Times New Roman" w:hAnsi="Times New Roman" w:eastAsia="Times New Roman"/>
+                <w:b w:val="0"/>
+                <w:i w:val="0"/>
+                <w:color w:val="1A1A2E"/>
+                <w:sz w:val="22"/>
+              </w:rPr>
+              <w:t>2</w:t>
+            </w:r>
+          </w:p>
+        </w:tc>
+        <w:tc>
+          <w:tcPr>
+            <w:tcW w:type="dxa" w:w="1871"/>
+          </w:tcPr>
+          <w:p>
+            <w:pPr>
+              <w:jc w:val="left"/>
+            </w:pPr>
+            <w:r>
+              <w:rPr>
+                <w:rFonts w:ascii="Times New Roman" w:hAnsi="Times New Roman" w:eastAsia="Times New Roman"/>
+                <w:b w:val="0"/>
+                <w:i w:val="0"/>
+                <w:color w:val="1A1A2E"/>
+                <w:sz w:val="22"/>
+              </w:rPr>
+              <w:t>соответствует</w:t>
+            </w:r>
+          </w:p>
+        </w:tc>
+      </w:tr>
+      <w:tr>
+        <w:tc>
+          <w:tcPr>
+            <w:tcW w:type="dxa" w:w="1871"/>
+          </w:tcPr>
+          <w:p>
+            <w:pPr>
+              <w:jc w:val="left"/>
+            </w:pPr>
+            <w:r>
+              <w:rPr>
+                <w:rFonts w:ascii="Times New Roman" w:hAnsi="Times New Roman" w:eastAsia="Times New Roman"/>
+                <w:b w:val="0"/>
+                <w:i w:val="0"/>
+                <w:color w:val="1A1A2E"/>
+                <w:sz w:val="22"/>
+              </w:rPr>
+              <w:t>Регламент. перерывы</w:t>
+            </w:r>
+          </w:p>
+        </w:tc>
+        <w:tc>
+          <w:tcPr>
+            <w:tcW w:type="dxa" w:w="1871"/>
+          </w:tcPr>
+          <w:p>
+            <w:pPr>
+              <w:jc w:val="left"/>
+            </w:pPr>
+            <w:r>
+              <w:rPr>
+                <w:rFonts w:ascii="Times New Roman" w:hAnsi="Times New Roman" w:eastAsia="Times New Roman"/>
+                <w:b w:val="0"/>
+                <w:i w:val="0"/>
+                <w:color w:val="1A1A2E"/>
+                <w:sz w:val="22"/>
+              </w:rPr>
+              <w:t>мин</w:t>
+            </w:r>
+          </w:p>
+        </w:tc>
+        <w:tc>
+          <w:tcPr>
+            <w:tcW w:type="dxa" w:w="1871"/>
+          </w:tcPr>
+          <w:p>
+            <w:pPr>
+              <w:jc w:val="left"/>
+            </w:pPr>
+            <w:r>
+              <w:rPr>
+                <w:rFonts w:ascii="Times New Roman" w:hAnsi="Times New Roman" w:eastAsia="Times New Roman"/>
+                <w:b w:val="0"/>
+                <w:i w:val="0"/>
+                <w:color w:val="1A1A2E"/>
+                <w:sz w:val="22"/>
+              </w:rPr>
+              <w:t>30-60</w:t>
+            </w:r>
+          </w:p>
+        </w:tc>
+        <w:tc>
+          <w:tcPr>
+            <w:tcW w:type="dxa" w:w="1871"/>
+          </w:tcPr>
+          <w:p>
+            <w:pPr>
+              <w:jc w:val="left"/>
+            </w:pPr>
+            <w:r>
+              <w:rPr>
+                <w:rFonts w:ascii="Times New Roman" w:hAnsi="Times New Roman" w:eastAsia="Times New Roman"/>
+                <w:b w:val="0"/>
+                <w:i w:val="0"/>
+                <w:color w:val="1A1A2E"/>
+                <w:sz w:val="22"/>
+              </w:rPr>
+              <w:t>50</w:t>
+            </w:r>
+          </w:p>
+        </w:tc>
+        <w:tc>
+          <w:tcPr>
+            <w:tcW w:type="dxa" w:w="1871"/>
+          </w:tcPr>
+          <w:p>
+            <w:pPr>
+              <w:jc w:val="left"/>
+            </w:pPr>
+            <w:r>
+              <w:rPr>
+                <w:rFonts w:ascii="Times New Roman" w:hAnsi="Times New Roman" w:eastAsia="Times New Roman"/>
+                <w:b w:val="0"/>
+                <w:i w:val="0"/>
+                <w:color w:val="1A1A2E"/>
+                <w:sz w:val="22"/>
+              </w:rPr>
+              <w:t>соответствует</w:t>
             </w:r>
           </w:p>
         </w:tc>
@@ -2220,7 +5229,41 @@
           <w:color w:val="1A1A2E"/>
           <w:sz w:val="28"/>
         </w:rPr>
-        <w:t>Необходимо отметить следующее: исследуемые показатели в целом удовлетворяют нормативным значениям охраны труда и безопасности в офисе ООО «ЛюксонДекор». Обнаружено отклонение: объем на одно рабочее место составляет 18 м³ при нормативе 20 м³ (отклонение 10%). Данное отклонение не является критичным и компенсируется наличием качественной приточно-вытяжной вентиляции производительностью 350 м³/ч, обеспечивающей кратность воздухообмена 3,9, что превышает нормативное значение 3,5.</w:t>
+        <w:t>Необходимо отметить следующее: исследуемые показатели в целом удовлетворяют нормативным значениям охраны труда и безопасности в офисе ООО «ЛюксонДекор».</w:t>
+      </w:r>
+    </w:p>
+    <w:p>
+      <w:pPr>
+        <w:spacing w:line="360" w:lineRule="auto" w:after="0" w:before="0"/>
+        <w:ind w:firstLine="709"/>
+        <w:jc w:val="both"/>
+      </w:pPr>
+      <w:r>
+        <w:rPr>
+          <w:rFonts w:ascii="Times New Roman" w:hAnsi="Times New Roman" w:eastAsia="Times New Roman"/>
+          <w:b w:val="0"/>
+          <w:i w:val="0"/>
+          <w:color w:val="1A1A2E"/>
+          <w:sz w:val="28"/>
+        </w:rPr>
+        <w:t>Однако было обнаружено следующее незначительное отклонение от норм: объем на одно рабочее место составляет 18 м3 при нормативе 20 м3 (отклонение 10%).</w:t>
+      </w:r>
+    </w:p>
+    <w:p>
+      <w:pPr>
+        <w:spacing w:line="360" w:lineRule="auto" w:after="0" w:before="0"/>
+        <w:ind w:firstLine="709"/>
+        <w:jc w:val="both"/>
+      </w:pPr>
+      <w:r>
+        <w:rPr>
+          <w:rFonts w:ascii="Times New Roman" w:hAnsi="Times New Roman" w:eastAsia="Times New Roman"/>
+          <w:b w:val="0"/>
+          <w:i w:val="0"/>
+          <w:color w:val="1A1A2E"/>
+          <w:sz w:val="28"/>
+        </w:rPr>
+        <w:t>Данное отклонение не является критичным и компенсируется наличием качественного искусственного освещения и приточно-вытяжной вентиляции производительностью 350 м3/ч.</w:t>
       </w:r>
     </w:p>
     <w:p>
@@ -2252,7 +5295,7 @@
           <w:color w:val="1A1A2E"/>
           <w:sz w:val="28"/>
         </w:rPr>
-        <w:t>В офисе ООО «ЛюксонДекор» разработана, издана и размещена документация по пожарному состоянию. Разработан план эвакуации, назначены ответственные лица за пожарную безопасность.</w:t>
+        <w:t>В офисе ООО «ЛюксонДекор» разработана, издана и размещена документация по пожарному состоянию.</w:t>
       </w:r>
     </w:p>
     <w:p>
@@ -2269,7 +5312,7 @@
           <w:color w:val="1A1A2E"/>
           <w:sz w:val="28"/>
         </w:rPr>
-        <w:t>Каждое помещение офиса оборудовано пожарной сигнализацией и огнетушителями. В помещениях с эксплуатацией ПК наиболее вероятны пожары классов «А» (горение твердых веществ — бумага, пластик корпусов) и «Е» (горение электроустановок под напряжением).</w:t>
+        <w:t>Каждое помещение офиса оборудовано пожарной сигнализацией и огнетушителями. В помещениях с эксплуатацией ПК наиболее вероятны пожары классов «А» и «Е».</w:t>
       </w:r>
     </w:p>
     <w:p>
@@ -2303,7 +5346,7 @@
           <w:color w:val="1A1A2E"/>
           <w:sz w:val="28"/>
         </w:rPr>
-        <w:t>Для тушения очагов возгорания в помещениях с ПК используются углекислотные огнетушители (ОУ-3) с массой заряда 3 кг. Углекислотные огнетушители не оставляют следов на оборудовании и безопасны для электронной техники, что делает их оптимальным выбором для помещений с компьютерами. В рассматриваемом помещении площадью 30 м² установлен 1 огнетушитель ОУ-3, что соответствует нормативам (1 огнетушитель на 40 м² для углекислотных).</w:t>
+        <w:t>Для тушения очагов возгорания используются углекислотные огнетушители с массой заряда 3 кг (ОУ-3), порошковые с массой заряда 4 кг (ОП-4). В офисных помещениях ООО «ЛюксонДекор» используются углекислотные огнетушители с массой заряда 3 кг (ОУ-3), количество которых соответствует количеству помещений, в которых находятся люди. В рассматриваемом помещении площадью 30 м2 установлен 1 огнетушитель ОУ-3, что соответствует нормативам (1 огнетушитель на 40 м2).</w:t>
       </w:r>
     </w:p>
     <w:p>
@@ -2320,24 +5363,7 @@
           <w:color w:val="1A1A2E"/>
           <w:sz w:val="28"/>
         </w:rPr>
-        <w:t>Также в помещении расположен пожарный извещатель автоматической пожарной сигнализации и табличка с указанием путей эвакуации.</w:t>
-      </w:r>
-    </w:p>
-    <w:p>
-      <w:pPr>
-        <w:spacing w:line="360" w:lineRule="auto" w:after="0" w:before="0"/>
-        <w:ind w:firstLine="709"/>
-        <w:jc w:val="both"/>
-      </w:pPr>
-      <w:r>
-        <w:rPr>
-          <w:rFonts w:ascii="Times New Roman" w:hAnsi="Times New Roman" w:eastAsia="Times New Roman"/>
-          <w:b w:val="0"/>
-          <w:i w:val="0"/>
-          <w:color w:val="1A1A2E"/>
-          <w:sz w:val="28"/>
-        </w:rPr>
-        <w:t>За соблюдение мер пожарной безопасности в служебных кабинетах отвечает руководитель предприятия ООО «ЛюксонДекор». С сотрудниками проводятся регулярные инструктажи по пожарной безопасности не реже 1 раза в полугодие.</w:t>
+        <w:t>За соблюдение мер безопасности в служебных кабинетах, иных помещениях отвечает руководитель предприятия ООО «ЛюксонДекор». Это общий принцип, который видоизменяется и дополняется законодателем.</w:t>
       </w:r>
     </w:p>
     <w:sectPr>

</xml_diff>